<commit_message>
Repo renamed PDC-Policy -> PDC-Policy-Generator; references swept
Renamed on GitHub (old URL redirects) to match the companion
PDC-Glossary-Generator. Updated the clone commands in README and
docs/INSTALL.md (workstation and ~/PDC-Demo nested layouts, including
the .git/info/exclude line), the changelog, and registry.py's
discovery docstring; lab-setup.docx regenerated. origin now points at
the new URL.

Co-Authored-By: Claude Fable 5 <noreply@anthropic.com>
</commit_message>
<xml_diff>
--- a/docs/lab-setup.docx
+++ b/docs/lab-setup.docx
@@ -815,7 +815,7 @@
           <w:szCs w:val="19"/>
           <w:color w:val="0A3D52"/>
         </w:rPr>
-        <w:t xml:space="preserve">git clone https://github.com/jporeilly/PDC-Policy.git</w:t>
+        <w:t xml:space="preserve">git clone https://github.com/jporeilly/PDC-Policy-Generator.git</w:t>
       </w:r>
     </w:p>
     <w:p>
@@ -834,7 +834,7 @@
           <w:szCs w:val="19"/>
           <w:color w:val="0A3D52"/>
         </w:rPr>
-        <w:t xml:space="preserve">cd PDC-Policy</w:t>
+        <w:t xml:space="preserve">cd PDC-Policy-Generator</w:t>
       </w:r>
     </w:p>
     <w:p>
@@ -956,7 +956,7 @@
           <w:szCs w:val="19"/>
           <w:color w:val="0A3D52"/>
         </w:rPr>
-        <w:t xml:space="preserve">git clone https://github.com/jporeilly/PDC-Policy.git</w:t>
+        <w:t xml:space="preserve">git clone https://github.com/jporeilly/PDC-Policy-Generator.git</w:t>
       </w:r>
     </w:p>
     <w:p>
@@ -975,7 +975,7 @@
           <w:szCs w:val="19"/>
           <w:color w:val="0A3D52"/>
         </w:rPr>
-        <w:t xml:space="preserve">echo "PDC-Policy/" &gt;&gt; .git/info/exclude   # keep the Glossary repo's `git status` clean</w:t>
+        <w:t xml:space="preserve">echo "PDC-Policy-Generator/" &gt;&gt; .git/info/exclude   # keep the Glossary repo's `git status` clean</w:t>
       </w:r>
     </w:p>
     <w:p>
@@ -994,7 +994,7 @@
           <w:szCs w:val="19"/>
           <w:color w:val="0A3D52"/>
         </w:rPr>
-        <w:t xml:space="preserve">cd PDC-Policy/policy_generator</w:t>
+        <w:t xml:space="preserve">cd PDC-Policy-Generator/policy_generator</w:t>
       </w:r>
     </w:p>
     <w:p>
@@ -1105,7 +1105,7 @@
           <w:sz w:val="20"/>
           <w:szCs w:val="20"/>
         </w:rPr>
-        <w:t xml:space="preserve">~/PDC-Policy</w:t>
+        <w:t xml:space="preserve">~/PDC-Policy-Generator</w:t>
       </w:r>
       <w:r>
         <w:t xml:space="preserve"> beside </w:t>

</xml_diff>

<commit_message>
Add install-into-pdc-demo.sh: one-script install/update on the lab VM
Checks the ~/PDC-Demo Glossary checkout exists (path arg or PDC_DEMO_DIR
override), clones PDC-Policy-Generator into it on first run — explicitly
named, and excluded from the outer repo's git status — or fast-forward-
pulls thereafter, prints the app version, runs the offline selftest, and
prints the run command. POLICY_REPO_URL override for forks/testing;
usable as a curl one-liner on a fresh VM.

Tested both paths against a simulated PDC-Demo (fresh clone leaves the
outer git status clean; re-run fast-forwards and passes the selftest).
docs/INSTALL.md now leads with the script and keeps the manual Ubuntu
commands; README layout tree + install section updated; lab-setup.docx
regenerated and Word-COM verified.

Co-Authored-By: Claude Fable 5 <noreply@anthropic.com>
</commit_message>
<xml_diff>
--- a/docs/lab-setup.docx
+++ b/docs/lab-setup.docx
@@ -918,7 +918,34 @@
         <w:t xml:space="preserve">inside</w:t>
       </w:r>
       <w:r>
-        <w:t xml:space="preserve"> that folder and keep the whole lab in one place; git treats a nested repo as a single untracked directory, the two never interfere:</w:t>
+        <w:t xml:space="preserve"> that folder and keep the whole lab in one place; git treats a nested repo as a single untracked directory, the two never interfere.</w:t>
+      </w:r>
+    </w:p>
+    <w:p>
+      <w:pPr>
+        <w:spacing w:after="120"/>
+      </w:pPr>
+      <w:r>
+        <w:rPr>
+          <w:b/>
+          <w:bCs/>
+        </w:rPr>
+        <w:t xml:space="preserve">The easy way</w:t>
+      </w:r>
+      <w:r>
+        <w:t xml:space="preserve"> — one script handles both the first install and every later update (checks the folder, clones or fast-forward-pulls, excludes the nested repo from the outer </w:t>
+      </w:r>
+      <w:r>
+        <w:rPr>
+          <w:rFonts w:ascii="Consolas" w:hAnsi="Consolas"/>
+          <w:color w:val="0A5560"/>
+          <w:sz w:val="20"/>
+          <w:szCs w:val="20"/>
+        </w:rPr>
+        <w:t xml:space="preserve">git status</w:t>
+      </w:r>
+      <w:r>
+        <w:t xml:space="preserve">, runs the selftest):</w:t>
       </w:r>
     </w:p>
     <w:p>
@@ -937,7 +964,41 @@
           <w:szCs w:val="19"/>
           <w:color w:val="0A3D52"/>
         </w:rPr>
-        <w:t xml:space="preserve">cd ~/PDC-Demo</w:t>
+        <w:t xml:space="preserve">curl -fsSL https://raw.githubusercontent.com/jporeilly/PDC-Policy-Generator/main/install-into-pdc-demo.sh | bash</w:t>
+      </w:r>
+    </w:p>
+    <w:p>
+      <w:pPr>
+        <w:pBdr>
+          <w:left w:val="single" w:sz="12" w:space="8" w:color="1C7293"/>
+        </w:pBdr>
+        <w:shd w:val="clear" w:color="auto" w:fill="F4F7F9"/>
+        <w:spacing w:before="0" w:after="120"/>
+        <w:ind w:left="240"/>
+      </w:pPr>
+      <w:r>
+        <w:rPr>
+          <w:rFonts w:ascii="Consolas" w:hAnsi="Consolas"/>
+          <w:sz w:val="19"/>
+          <w:szCs w:val="19"/>
+          <w:color w:val="0A3D52"/>
+        </w:rPr>
+        <w:t xml:space="preserve"># or, from a checkout:  ./install-into-pdc-demo.sh [/path/to/PDC-Demo]</w:t>
+      </w:r>
+    </w:p>
+    <w:p>
+      <w:pPr>
+        <w:spacing w:after="120"/>
+      </w:pPr>
+      <w:r>
+        <w:rPr>
+          <w:b/>
+          <w:bCs/>
+        </w:rPr>
+        <w:t xml:space="preserve">By hand</w:t>
+      </w:r>
+      <w:r>
+        <w:t xml:space="preserve">, the equivalent on Ubuntu 24.04:</w:t>
       </w:r>
     </w:p>
     <w:p>
@@ -956,7 +1017,7 @@
           <w:szCs w:val="19"/>
           <w:color w:val="0A3D52"/>
         </w:rPr>
-        <w:t xml:space="preserve">git clone https://github.com/jporeilly/PDC-Policy-Generator.git</w:t>
+        <w:t xml:space="preserve">cd ~/PDC-Demo</w:t>
       </w:r>
     </w:p>
     <w:p>
@@ -975,7 +1036,7 @@
           <w:szCs w:val="19"/>
           <w:color w:val="0A3D52"/>
         </w:rPr>
-        <w:t xml:space="preserve">echo "PDC-Policy-Generator/" &gt;&gt; .git/info/exclude   # keep the Glossary repo's `git status` clean</w:t>
+        <w:t xml:space="preserve">git clone https://github.com/jporeilly/PDC-Policy-Generator.git</w:t>
       </w:r>
     </w:p>
     <w:p>
@@ -994,6 +1055,25 @@
           <w:szCs w:val="19"/>
           <w:color w:val="0A3D52"/>
         </w:rPr>
+        <w:t xml:space="preserve">echo "PDC-Policy-Generator/" &gt;&gt; .git/info/exclude   # keep the Glossary repo's `git status` clean</w:t>
+      </w:r>
+    </w:p>
+    <w:p>
+      <w:pPr>
+        <w:pBdr>
+          <w:left w:val="single" w:sz="12" w:space="8" w:color="1C7293"/>
+        </w:pBdr>
+        <w:shd w:val="clear" w:color="auto" w:fill="F4F7F9"/>
+        <w:spacing w:before="0" w:after="0"/>
+        <w:ind w:left="240"/>
+      </w:pPr>
+      <w:r>
+        <w:rPr>
+          <w:rFonts w:ascii="Consolas" w:hAnsi="Consolas"/>
+          <w:sz w:val="19"/>
+          <w:szCs w:val="19"/>
+          <w:color w:val="0A3D52"/>
+        </w:rPr>
         <w:t xml:space="preserve">cd PDC-Policy-Generator/policy_generator</w:t>
       </w:r>
     </w:p>
@@ -1014,6 +1094,26 @@
           <w:color w:val="0A3D52"/>
         </w:rPr>
         <w:t xml:space="preserve">bash run.sh --host 0.0.0.0        # VM checkouts may lack exec bits — bash, not ./</w:t>
+      </w:r>
+    </w:p>
+    <w:p>
+      <w:pPr>
+        <w:spacing w:after="120"/>
+      </w:pPr>
+      <w:r>
+        <w:t xml:space="preserve">(Already cloned? </w:t>
+      </w:r>
+      <w:r>
+        <w:rPr>
+          <w:rFonts w:ascii="Consolas" w:hAnsi="Consolas"/>
+          <w:color w:val="0A5560"/>
+          <w:sz w:val="20"/>
+          <w:szCs w:val="20"/>
+        </w:rPr>
+        <w:t xml:space="preserve">git -C ~/PDC-Demo/PDC-Policy-Generator pull</w:t>
+      </w:r>
+      <w:r>
+        <w:t xml:space="preserve"> — or just re-run the script.)</w:t>
       </w:r>
     </w:p>
     <w:p>

</xml_diff>

<commit_message>
1.1.3: VM install is app-only (sparse clone)
install-into-pdc-demo.sh now sparse-clones (--filter=blob:none --sparse,
checkout set to policy_generator/): the lab VM gets the app and root
files only - courseware and docs never land on the deployment. Re-runs
still fast-forward-pull; existing full clones keep working. Tested both
paths against a simulated PDC-Demo. INSTALL.md updated, lab-setup.docx
regenerated.

Co-Authored-By: Claude Fable 5 <noreply@anthropic.com>
</commit_message>
<xml_diff>
--- a/docs/lab-setup.docx
+++ b/docs/lab-setup.docx
@@ -933,7 +933,29 @@
         <w:t xml:space="preserve">The easy way</w:t>
       </w:r>
       <w:r>
-        <w:t xml:space="preserve"> — one script handles both the first install and every later update (checks the folder, clones or fast-forward-pulls, excludes the nested repo from the outer </w:t>
+        <w:t xml:space="preserve"> — one script handles both the first install and every later update (checks the folder, </w:t>
+      </w:r>
+      <w:r>
+        <w:rPr>
+          <w:b/>
+          <w:bCs/>
+        </w:rPr>
+        <w:t xml:space="preserve">sparse-clones only the app</w:t>
+      </w:r>
+      <w:r>
+        <w:t xml:space="preserve"> — </w:t>
+      </w:r>
+      <w:r>
+        <w:rPr>
+          <w:rFonts w:ascii="Consolas" w:hAnsi="Consolas"/>
+          <w:color w:val="0A5560"/>
+          <w:sz w:val="20"/>
+          <w:szCs w:val="20"/>
+        </w:rPr>
+        <w:t xml:space="preserve">policy_generator/</w:t>
+      </w:r>
+      <w:r>
+        <w:t xml:space="preserve"> plus root files; courseware and docs stay off the VM — or fast-forward-pulls on re-runs, excludes the nested repo from the outer </w:t>
       </w:r>
       <w:r>
         <w:rPr>

</xml_diff>

<commit_message>
1.2.0: courseware moved to PDC-Scenarios; installer is vertical-aware
Courseware now lives in github.com/jporeilly/PDC-Scenarios, separated
per app within each vertical (courseware/<ID>/Policy/ beside Platform/
and Glossary/). This repo keeps docs/tools/ so docs/lab-setup.docx
still regenerates from INSTALL.md.

install-into-pdc-demo.sh: pass a vertical (CSCU/RETAIL/HEALTH/MFG) and
it clones/updates PDC-Scenarios beside the app - sparse with
--no-checkout first, so only the selected vertical's data kit +
courseware ever touch disk - and bare re-runs detect the selected
vertical from the sparse state and refresh it. Tested: select,
auto-detect, and switching verticals; outer git status stays clean.

Docs + UI swept (README, INSTALL.md incl. the PDC-Scenarios lab
pointer, the web UI import hint). Selftest 20/20.

Co-Authored-By: Claude Fable 5 <noreply@anthropic.com>
</commit_message>
<xml_diff>
--- a/docs/lab-setup.docx
+++ b/docs/lab-setup.docx
@@ -487,7 +487,7 @@
                 <w:b/>
                 <w:bCs/>
               </w:rPr>
-              <w:t xml:space="preserve">The shared lab + a scenario</w:t>
+              <w:t xml:space="preserve">The shared lab + a vertical</w:t>
             </w:r>
             <w:r>
               <w:t xml:space="preserve"> (e.g. CSCU)</w:t>
@@ -528,7 +528,13 @@
               <w:spacing w:after="0"/>
             </w:pPr>
             <w:r>
-              <w:t xml:space="preserve">the Glossary repo's guide: </w:t>
+              <w:t xml:space="preserve">the </w:t>
+            </w:r>
+            <w:r>
+              <w:t xml:space="preserve">PDC-Scenarios (https://github.com/jporeilly/PDC-Scenarios)</w:t>
+            </w:r>
+            <w:r>
+              <w:t xml:space="preserve"> repo — </w:t>
             </w:r>
             <w:r>
               <w:rPr>
@@ -537,10 +543,22 @@
                 <w:sz w:val="20"/>
                 <w:szCs w:val="20"/>
               </w:rPr>
-              <w:t xml:space="preserve">PDC-Glossary-Generator/data_sources/lab/lab-setup.docx</w:t>
-            </w:r>
-            <w:r>
-              <w:t xml:space="preserve"> (Parts A–I) — the one-time build of the PDC VM, network, lab stack and scenario load</w:t>
+              <w:t xml:space="preserve">select-vertical.sh &lt;ID&gt;</w:t>
+            </w:r>
+            <w:r>
+              <w:t xml:space="preserve"> pulls it; its </w:t>
+            </w:r>
+            <w:r>
+              <w:rPr>
+                <w:rFonts w:ascii="Consolas" w:hAnsi="Consolas"/>
+                <w:color w:val="0A5560"/>
+                <w:sz w:val="20"/>
+                <w:szCs w:val="20"/>
+              </w:rPr>
+              <w:t xml:space="preserve">data_sources/lab/lab-setup.docx</w:t>
+            </w:r>
+            <w:r>
+              <w:t xml:space="preserve"> (Parts A–I) is the one-time VM/lab build guide</w:t>
             </w:r>
           </w:p>
         </w:tc>
@@ -933,7 +951,7 @@
         <w:t xml:space="preserve">The easy way</w:t>
       </w:r>
       <w:r>
-        <w:t xml:space="preserve"> — one script handles both the first install and every later update (checks the folder, </w:t>
+        <w:t xml:space="preserve"> — one script handles both the first install and every later update. It checks the folder, </w:t>
       </w:r>
       <w:r>
         <w:rPr>
@@ -955,7 +973,7 @@
         <w:t xml:space="preserve">policy_generator/</w:t>
       </w:r>
       <w:r>
-        <w:t xml:space="preserve"> plus root files; courseware and docs stay off the VM — or fast-forward-pulls on re-runs, excludes the nested repo from the outer </w:t>
+        <w:t xml:space="preserve"> plus root files — or fast-forward-pulls on re-runs, excludes the nested repo from the outer </w:t>
       </w:r>
       <w:r>
         <w:rPr>
@@ -967,7 +985,65 @@
         <w:t xml:space="preserve">git status</w:t>
       </w:r>
       <w:r>
-        <w:t xml:space="preserve">, runs the selftest):</w:t>
+        <w:t xml:space="preserve">, and runs the selftest. Pass a vertical (</w:t>
+      </w:r>
+      <w:r>
+        <w:rPr>
+          <w:rFonts w:ascii="Consolas" w:hAnsi="Consolas"/>
+          <w:color w:val="0A5560"/>
+          <w:sz w:val="20"/>
+          <w:szCs w:val="20"/>
+        </w:rPr>
+        <w:t xml:space="preserve">CSCU</w:t>
+      </w:r>
+      <w:r>
+        <w:t xml:space="preserve">/</w:t>
+      </w:r>
+      <w:r>
+        <w:rPr>
+          <w:rFonts w:ascii="Consolas" w:hAnsi="Consolas"/>
+          <w:color w:val="0A5560"/>
+          <w:sz w:val="20"/>
+          <w:szCs w:val="20"/>
+        </w:rPr>
+        <w:t xml:space="preserve">RETAIL</w:t>
+      </w:r>
+      <w:r>
+        <w:t xml:space="preserve">/</w:t>
+      </w:r>
+      <w:r>
+        <w:rPr>
+          <w:rFonts w:ascii="Consolas" w:hAnsi="Consolas"/>
+          <w:color w:val="0A5560"/>
+          <w:sz w:val="20"/>
+          <w:szCs w:val="20"/>
+        </w:rPr>
+        <w:t xml:space="preserve">HEALTH</w:t>
+      </w:r>
+      <w:r>
+        <w:t xml:space="preserve">/</w:t>
+      </w:r>
+      <w:r>
+        <w:rPr>
+          <w:rFonts w:ascii="Consolas" w:hAnsi="Consolas"/>
+          <w:color w:val="0A5560"/>
+          <w:sz w:val="20"/>
+          <w:szCs w:val="20"/>
+        </w:rPr>
+        <w:t xml:space="preserve">MFG</w:t>
+      </w:r>
+      <w:r>
+        <w:t xml:space="preserve">) and it also clones/updates </w:t>
+      </w:r>
+      <w:r>
+        <w:rPr>
+          <w:b/>
+          <w:bCs/>
+        </w:rPr>
+        <w:t xml:space="preserve">PDC-Scenarios</w:t>
+      </w:r>
+      <w:r>
+        <w:t xml:space="preserve"> beside the app and sparse-pulls just that vertical's data kit and courseware; bare re-runs detect the selected vertical and refresh it:</w:t>
       </w:r>
     </w:p>
     <w:p>
@@ -986,7 +1062,7 @@
           <w:szCs w:val="19"/>
           <w:color w:val="0A3D52"/>
         </w:rPr>
-        <w:t xml:space="preserve">curl -fsSL https://raw.githubusercontent.com/jporeilly/PDC-Policy-Generator/main/install-into-pdc-demo.sh | bash</w:t>
+        <w:t xml:space="preserve">curl -fsSL https://raw.githubusercontent.com/jporeilly/PDC-Policy-Generator/main/install-into-pdc-demo.sh | bash -s -- CSCU</w:t>
       </w:r>
     </w:p>
     <w:p>
@@ -1005,7 +1081,7 @@
           <w:szCs w:val="19"/>
           <w:color w:val="0A3D52"/>
         </w:rPr>
-        <w:t xml:space="preserve"># or, from a checkout:  ./install-into-pdc-demo.sh [/path/to/PDC-Demo]</w:t>
+        <w:t xml:space="preserve"># or, from a checkout:  ./install-into-pdc-demo.sh [/path/to/PDC-Demo] [VERTICAL]</w:t>
       </w:r>
     </w:p>
     <w:p>
@@ -1563,7 +1639,7 @@
                 <w:sz w:val="20"/>
                 <w:szCs w:val="20"/>
               </w:rPr>
-              <w:t xml:space="preserve">courseware/CSCU/</w:t>
+              <w:t xml:space="preserve">docs/tools/</w:t>
             </w:r>
           </w:p>
         </w:tc>
@@ -1582,7 +1658,7 @@
               <w:spacing w:after="0"/>
             </w:pPr>
             <w:r>
-              <w:t xml:space="preserve">the CSCU workshop set for this app (+ the Word-guide builder in </w:t>
+              <w:t xml:space="preserve">the Word-guide builder that regenerates </w:t>
             </w:r>
             <w:r>
               <w:rPr>
@@ -1591,7 +1667,19 @@
                 <w:sz w:val="20"/>
                 <w:szCs w:val="20"/>
               </w:rPr>
-              <w:t xml:space="preserve">tools/</w:t>
+              <w:t xml:space="preserve">docs/lab-setup.docx</w:t>
+            </w:r>
+            <w:r>
+              <w:t xml:space="preserve"> (the workshops live in the PDC-Scenarios repo under </w:t>
+            </w:r>
+            <w:r>
+              <w:rPr>
+                <w:rFonts w:ascii="Consolas" w:hAnsi="Consolas"/>
+                <w:color w:val="0A5560"/>
+                <w:sz w:val="20"/>
+                <w:szCs w:val="20"/>
+              </w:rPr>
+              <w:t xml:space="preserve">courseware/&lt;ID&gt;/Policy/</w:t>
             </w:r>
             <w:r>
               <w:t xml:space="preserve">)</w:t>
@@ -2154,7 +2242,7 @@
         <w:spacing w:after="120"/>
       </w:pPr>
       <w:r>
-        <w:t xml:space="preserve">The authored zip is shaped for PDC's UI import — the full walkthrough with checkpoints is the CSCU workshop (</w:t>
+        <w:t xml:space="preserve">The authored zip is shaped for PDC's UI import — the full walkthrough with checkpoints is the CSCU workshop (PDC-Scenarios' </w:t>
       </w:r>
       <w:r>
         <w:rPr>
@@ -2163,7 +2251,7 @@
           <w:sz w:val="20"/>
           <w:szCs w:val="20"/>
         </w:rPr>
-        <w:t xml:space="preserve">courseware/CSCU/Workshop-Policy-Generator-CSCU.md</w:t>
+        <w:t xml:space="preserve">courseware/CSCU/Policy/Workshop-Policy-Generator-CSCU.md</w:t>
       </w:r>
       <w:r>
         <w:t xml:space="preserve">). In short:</w:t>

</xml_diff>

<commit_message>
Rename installer: install-into-pdc-demo.sh -> install-pdc-demo.sh
The old name read wrong (the twin Glossary script CREATES PDC-Demo, and
this one installs the app into it). Same name in both repos now; curl
one-liners and all doc references swept; lab-setup.docx regenerated.

Co-Authored-By: Claude Fable 5 <noreply@anthropic.com>
</commit_message>
<xml_diff>
--- a/docs/lab-setup.docx
+++ b/docs/lab-setup.docx
@@ -1062,7 +1062,7 @@
           <w:szCs w:val="19"/>
           <w:color w:val="0A3D52"/>
         </w:rPr>
-        <w:t xml:space="preserve">curl -fsSL https://raw.githubusercontent.com/jporeilly/PDC-Policy-Generator/main/install-into-pdc-demo.sh | bash -s -- CSCU</w:t>
+        <w:t xml:space="preserve">curl -fsSL https://raw.githubusercontent.com/jporeilly/PDC-Policy-Generator/main/install-pdc-demo.sh | bash -s -- CSCU</w:t>
       </w:r>
     </w:p>
     <w:p>
@@ -1081,7 +1081,7 @@
           <w:szCs w:val="19"/>
           <w:color w:val="0A3D52"/>
         </w:rPr>
-        <w:t xml:space="preserve"># or, from a checkout:  ./install-into-pdc-demo.sh [/path/to/PDC-Demo] [VERTICAL]</w:t>
+        <w:t xml:space="preserve"># or, from a checkout:  ./install-pdc-demo.sh [/path/to/PDC-Demo] [VERTICAL]</w:t>
       </w:r>
     </w:p>
     <w:p>

</xml_diff>

<commit_message>
Docs: lead with the PDC-Scenarios one-command bootstrap; lab-setup.docx regenerated
Co-Authored-By: Claude Fable 5 <noreply@anthropic.com>
</commit_message>
<xml_diff>
--- a/docs/lab-setup.docx
+++ b/docs/lab-setup.docx
@@ -948,10 +948,97 @@
           <w:b/>
           <w:bCs/>
         </w:rPr>
-        <w:t xml:space="preserve">The easy way</w:t>
-      </w:r>
-      <w:r>
-        <w:t xml:space="preserve"> — one script handles both the first install and every later update. It checks the folder, </w:t>
+        <w:t xml:space="preserve">The whole lab in one command</w:t>
+      </w:r>
+      <w:r>
+        <w:t xml:space="preserve"> — PDC-Scenarios' bootstrap stands up </w:t>
+      </w:r>
+      <w:r>
+        <w:rPr>
+          <w:rFonts w:ascii="Consolas" w:hAnsi="Consolas"/>
+          <w:color w:val="0A5560"/>
+          <w:sz w:val="20"/>
+          <w:szCs w:val="20"/>
+        </w:rPr>
+        <w:t xml:space="preserve">~/PDC-Demo</w:t>
+      </w:r>
+      <w:r>
+        <w:t xml:space="preserve"> with the Glossary app, </w:t>
+      </w:r>
+      <w:r>
+        <w:rPr>
+          <w:b/>
+          <w:bCs/>
+        </w:rPr>
+        <w:t xml:space="preserve">this app</w:t>
+      </w:r>
+      <w:r>
+        <w:t xml:space="preserve">, and the selected vertical, then </w:t>
+      </w:r>
+      <w:r>
+        <w:rPr>
+          <w:rFonts w:ascii="Consolas" w:hAnsi="Consolas"/>
+          <w:color w:val="0A5560"/>
+          <w:sz w:val="20"/>
+          <w:szCs w:val="20"/>
+        </w:rPr>
+        <w:t xml:space="preserve">make scenario ID=&lt;ID&gt;</w:t>
+      </w:r>
+      <w:r>
+        <w:t xml:space="preserve"> there loads the data sources:</w:t>
+      </w:r>
+    </w:p>
+    <w:p>
+      <w:pPr>
+        <w:pBdr>
+          <w:left w:val="single" w:sz="12" w:space="8" w:color="1C7293"/>
+        </w:pBdr>
+        <w:shd w:val="clear" w:color="auto" w:fill="F4F7F9"/>
+        <w:spacing w:before="0" w:after="0"/>
+        <w:ind w:left="240"/>
+      </w:pPr>
+      <w:r>
+        <w:rPr>
+          <w:rFonts w:ascii="Consolas" w:hAnsi="Consolas"/>
+          <w:sz w:val="19"/>
+          <w:szCs w:val="19"/>
+          <w:color w:val="0A3D52"/>
+        </w:rPr>
+        <w:t xml:space="preserve">curl -fsSL https://raw.githubusercontent.com/jporeilly/PDC-Scenarios/main/install-pdc-demo.sh | bash -s -- CSCU</w:t>
+      </w:r>
+    </w:p>
+    <w:p>
+      <w:pPr>
+        <w:pBdr>
+          <w:left w:val="single" w:sz="12" w:space="8" w:color="1C7293"/>
+        </w:pBdr>
+        <w:shd w:val="clear" w:color="auto" w:fill="F4F7F9"/>
+        <w:spacing w:before="0" w:after="120"/>
+        <w:ind w:left="240"/>
+      </w:pPr>
+      <w:r>
+        <w:rPr>
+          <w:rFonts w:ascii="Consolas" w:hAnsi="Consolas"/>
+          <w:sz w:val="19"/>
+          <w:szCs w:val="19"/>
+          <w:color w:val="0A3D52"/>
+        </w:rPr>
+        <w:t xml:space="preserve">cd ~/PDC-Demo/PDC-Scenarios &amp;&amp; make scenario ID=CSCU</w:t>
+      </w:r>
+    </w:p>
+    <w:p>
+      <w:pPr>
+        <w:spacing w:after="120"/>
+      </w:pPr>
+      <w:r>
+        <w:rPr>
+          <w:b/>
+          <w:bCs/>
+        </w:rPr>
+        <w:t xml:space="preserve">Just this app</w:t>
+      </w:r>
+      <w:r>
+        <w:t xml:space="preserve"> — this repo's script handles both the first install and every later update. It checks the folder, </w:t>
       </w:r>
       <w:r>
         <w:rPr>

</xml_diff>

<commit_message>
INSTALL: the standard topology (apps on Windows host, lab+PDC on VM) with both bootstraps; lab-setup.docx regenerated
Co-Authored-By: Claude Fable 5 <noreply@anthropic.com>
</commit_message>
<xml_diff>
--- a/docs/lab-setup.docx
+++ b/docs/lab-setup.docx
@@ -807,6 +807,356 @@
       </w:r>
       <w:r>
         <w:t xml:space="preserve"> — the evidence this app authors from (induced regexes, profiled value lists) was already gathered by the Glossary app's scan and travels inside the Registry.</w:t>
+      </w:r>
+    </w:p>
+    <w:p>
+      <w:pPr>
+        <w:pStyle w:val="Heading1"/>
+      </w:pPr>
+      <w:r>
+        <w:t xml:space="preserve">The standard topology — where everything runs</w:t>
+      </w:r>
+    </w:p>
+    <w:tbl>
+      <w:tblPr>
+        <w:tblW w:w="9360" w:type="dxa"/>
+        <w:tblBorders>
+          <w:top w:val="single" w:sz="4" w:space="0" w:color="C9DEE8"/>
+          <w:left w:val="single" w:sz="4" w:space="0" w:color="C9DEE8"/>
+          <w:bottom w:val="single" w:sz="4" w:space="0" w:color="C9DEE8"/>
+          <w:right w:val="single" w:sz="4" w:space="0" w:color="C9DEE8"/>
+          <w:insideH w:val="single" w:sz="4" w:space="0" w:color="C9DEE8"/>
+          <w:insideV w:val="single" w:sz="4" w:space="0" w:color="C9DEE8"/>
+        </w:tblBorders>
+      </w:tblPr>
+      <w:tblGrid>
+        <w:gridCol w:w="2340"/>
+        <w:gridCol w:w="2340"/>
+        <w:gridCol w:w="2340"/>
+        <w:gridCol w:w="2340"/>
+      </w:tblGrid>
+      <w:tr>
+        <w:tc>
+          <w:tcPr>
+            <w:tcW w:w="2340" w:type="dxa"/>
+            <w:shd w:val="clear" w:color="auto" w:fill="EEF6FA"/>
+            <w:tcBorders>
+              <w:left w:val="single" w:sz="12" w:space="0" w:color="065A82"/>
+            </w:tcBorders>
+            <w:tcMar>
+              <w:top w:w="120" w:type="dxa"/>
+              <w:left w:w="180" w:type="dxa"/>
+              <w:bottom w:w="120" w:type="dxa"/>
+              <w:right w:w="180" w:type="dxa"/>
+            </w:tcMar>
+          </w:tcPr>
+          <w:p>
+            <w:pPr>
+              <w:spacing w:after="0"/>
+            </w:pPr>
+            <w:r>
+              <w:rPr>
+                <w:b/>
+                <w:bCs/>
+              </w:rPr>
+              <w:t xml:space="preserve">Where</w:t>
+            </w:r>
+          </w:p>
+        </w:tc>
+        <w:tc>
+          <w:tcPr>
+            <w:tcW w:w="2340" w:type="dxa"/>
+            <w:shd w:val="clear" w:color="auto" w:fill="EEF6FA"/>
+            <w:tcMar>
+              <w:top w:w="120" w:type="dxa"/>
+              <w:left w:w="180" w:type="dxa"/>
+              <w:bottom w:w="120" w:type="dxa"/>
+              <w:right w:w="180" w:type="dxa"/>
+            </w:tcMar>
+          </w:tcPr>
+          <w:p>
+            <w:pPr>
+              <w:spacing w:after="0"/>
+            </w:pPr>
+            <w:r>
+              <w:rPr>
+                <w:b/>
+                <w:bCs/>
+              </w:rPr>
+              <w:t xml:space="preserve">What runs there</w:t>
+            </w:r>
+          </w:p>
+        </w:tc>
+        <w:tc>
+          <w:tcPr>
+            <w:tcW w:w="2340" w:type="dxa"/>
+            <w:shd w:val="clear" w:color="auto" w:fill="EEF6FA"/>
+            <w:tcMar>
+              <w:top w:w="120" w:type="dxa"/>
+              <w:left w:w="180" w:type="dxa"/>
+              <w:bottom w:w="120" w:type="dxa"/>
+              <w:right w:w="180" w:type="dxa"/>
+            </w:tcMar>
+          </w:tcPr>
+          <w:p>
+            <w:pPr>
+              <w:spacing w:after="0"/>
+            </w:pPr>
+            <w:r>
+              <w:rPr>
+                <w:b/>
+                <w:bCs/>
+              </w:rPr>
+              <w:t xml:space="preserve">One-command install/update</w:t>
+            </w:r>
+          </w:p>
+        </w:tc>
+        <w:tc>
+          <w:tcPr>
+            <w:tcW w:w="2340" w:type="dxa"/>
+            <w:shd w:val="clear" w:color="auto" w:fill="EEF6FA"/>
+            <w:tcMar>
+              <w:top w:w="120" w:type="dxa"/>
+              <w:left w:w="180" w:type="dxa"/>
+              <w:bottom w:w="120" w:type="dxa"/>
+              <w:right w:w="180" w:type="dxa"/>
+            </w:tcMar>
+          </w:tcPr>
+          <w:p>
+            <w:pPr>
+              <w:spacing w:after="0"/>
+            </w:pPr>
+            <w:r>
+              <w:t xml:space="preserve"/>
+            </w:r>
+          </w:p>
+        </w:tc>
+      </w:tr>
+      <w:tr>
+        <w:tc>
+          <w:tcPr>
+            <w:tcW w:w="2340" w:type="dxa"/>
+            <w:tcMar>
+              <w:top w:w="120" w:type="dxa"/>
+              <w:left w:w="180" w:type="dxa"/>
+              <w:bottom w:w="120" w:type="dxa"/>
+              <w:right w:w="180" w:type="dxa"/>
+            </w:tcMar>
+          </w:tcPr>
+          <w:p>
+            <w:pPr>
+              <w:spacing w:after="0"/>
+            </w:pPr>
+            <w:r>
+              <w:rPr>
+                <w:b/>
+                <w:bCs/>
+              </w:rPr>
+              <w:t xml:space="preserve">Windows host</w:t>
+            </w:r>
+            <w:r>
+              <w:t xml:space="preserve"> (bare metal)</w:t>
+            </w:r>
+          </w:p>
+        </w:tc>
+        <w:tc>
+          <w:tcPr>
+            <w:tcW w:w="2340" w:type="dxa"/>
+            <w:tcMar>
+              <w:top w:w="120" w:type="dxa"/>
+              <w:left w:w="180" w:type="dxa"/>
+              <w:bottom w:w="120" w:type="dxa"/>
+              <w:right w:w="180" w:type="dxa"/>
+            </w:tcMar>
+          </w:tcPr>
+          <w:p>
+            <w:pPr>
+              <w:spacing w:after="0"/>
+            </w:pPr>
+            <w:r>
+              <w:t xml:space="preserve">both apps — the Glossary Generator (:5000, Ollama here) and this app (:5001) — plus the vertical's courseware and domain pack</w:t>
+            </w:r>
+          </w:p>
+        </w:tc>
+        <w:tc>
+          <w:tcPr>
+            <w:tcW w:w="2340" w:type="dxa"/>
+            <w:tcMar>
+              <w:top w:w="120" w:type="dxa"/>
+              <w:left w:w="180" w:type="dxa"/>
+              <w:bottom w:w="120" w:type="dxa"/>
+              <w:right w:w="180" w:type="dxa"/>
+            </w:tcMar>
+          </w:tcPr>
+          <w:p>
+            <w:pPr>
+              <w:spacing w:after="0"/>
+            </w:pPr>
+            <w:r>
+              <w:t xml:space="preserve">PowerShell: </w:t>
+            </w:r>
+            <w:r>
+              <w:rPr>
+                <w:rFonts w:ascii="Consolas" w:hAnsi="Consolas"/>
+                <w:color w:val="0A5560"/>
+                <w:sz w:val="20"/>
+                <w:szCs w:val="20"/>
+              </w:rPr>
+              <w:t xml:space="preserve">iex "&amp; { $(irm https://raw.githubusercontent.com/jporeilly/PDC-Scenarios/main/install-pdc-demo.ps1) } CSCU"</w:t>
+            </w:r>
+          </w:p>
+        </w:tc>
+        <w:tc>
+          <w:tcPr>
+            <w:tcW w:w="2340" w:type="dxa"/>
+            <w:tcMar>
+              <w:top w:w="120" w:type="dxa"/>
+              <w:left w:w="180" w:type="dxa"/>
+              <w:bottom w:w="120" w:type="dxa"/>
+              <w:right w:w="180" w:type="dxa"/>
+            </w:tcMar>
+          </w:tcPr>
+          <w:p>
+            <w:pPr>
+              <w:spacing w:after="0"/>
+            </w:pPr>
+            <w:r>
+              <w:t xml:space="preserve"/>
+            </w:r>
+          </w:p>
+        </w:tc>
+      </w:tr>
+      <w:tr>
+        <w:tc>
+          <w:tcPr>
+            <w:tcW w:w="2340" w:type="dxa"/>
+            <w:tcMar>
+              <w:top w:w="120" w:type="dxa"/>
+              <w:left w:w="180" w:type="dxa"/>
+              <w:bottom w:w="120" w:type="dxa"/>
+              <w:right w:w="180" w:type="dxa"/>
+            </w:tcMar>
+          </w:tcPr>
+          <w:p>
+            <w:pPr>
+              <w:spacing w:after="0"/>
+            </w:pPr>
+            <w:r>
+              <w:rPr>
+                <w:b/>
+                <w:bCs/>
+              </w:rPr>
+              <w:t xml:space="preserve">Ubuntu VM</w:t>
+            </w:r>
+            <w:r>
+              <w:t xml:space="preserve"> (192.168.1.200)</w:t>
+            </w:r>
+          </w:p>
+        </w:tc>
+        <w:tc>
+          <w:tcPr>
+            <w:tcW w:w="2340" w:type="dxa"/>
+            <w:tcMar>
+              <w:top w:w="120" w:type="dxa"/>
+              <w:left w:w="180" w:type="dxa"/>
+              <w:bottom w:w="120" w:type="dxa"/>
+              <w:right w:w="180" w:type="dxa"/>
+            </w:tcMar>
+          </w:tcPr>
+          <w:p>
+            <w:pPr>
+              <w:spacing w:after="0"/>
+            </w:pPr>
+            <w:r>
+              <w:t xml:space="preserve">PDC 11.0.0 itself + the demo lab (Postgres 5433, MinIO)</w:t>
+            </w:r>
+          </w:p>
+        </w:tc>
+        <w:tc>
+          <w:tcPr>
+            <w:tcW w:w="2340" w:type="dxa"/>
+            <w:tcMar>
+              <w:top w:w="120" w:type="dxa"/>
+              <w:left w:w="180" w:type="dxa"/>
+              <w:bottom w:w="120" w:type="dxa"/>
+              <w:right w:w="180" w:type="dxa"/>
+            </w:tcMar>
+          </w:tcPr>
+          <w:p>
+            <w:pPr>
+              <w:spacing w:after="0"/>
+            </w:pPr>
+            <w:r>
+              <w:t xml:space="preserve">`curl -fsSL https://raw.githubusercontent.com/jporeilly/PDC-Scenarios/main/install-pdc-demo.sh \</w:t>
+            </w:r>
+          </w:p>
+        </w:tc>
+        <w:tc>
+          <w:tcPr>
+            <w:tcW w:w="2340" w:type="dxa"/>
+            <w:tcMar>
+              <w:top w:w="120" w:type="dxa"/>
+              <w:left w:w="180" w:type="dxa"/>
+              <w:bottom w:w="120" w:type="dxa"/>
+              <w:right w:w="180" w:type="dxa"/>
+            </w:tcMar>
+          </w:tcPr>
+          <w:p>
+            <w:pPr>
+              <w:spacing w:after="0"/>
+            </w:pPr>
+            <w:r>
+              <w:t xml:space="preserve">bash -s -- CSCU</w:t>
+            </w:r>
+            <w:r>
+              <w:rPr>
+                <w:rFonts w:ascii="Consolas" w:hAnsi="Consolas"/>
+                <w:color w:val="0A5560"/>
+                <w:sz w:val="20"/>
+                <w:szCs w:val="20"/>
+              </w:rPr>
+              <w:t xml:space="preserve"> then </w:t>
+            </w:r>
+            <w:r>
+              <w:t xml:space="preserve">cd ~/PDC-Demo/PDC-Scenarios &amp;&amp; make scenario ID=CSCU`</w:t>
+            </w:r>
+          </w:p>
+        </w:tc>
+      </w:tr>
+    </w:tbl>
+    <w:p>
+      <w:pPr>
+        <w:spacing w:after="120"/>
+      </w:pPr>
+    </w:p>
+    <w:p>
+      <w:pPr>
+        <w:spacing w:after="120"/>
+      </w:pPr>
+      <w:r>
+        <w:t xml:space="preserve">Both bootstraps live in the PDC-Scenarios repo, remember the selected vertical, and are safe to re-run (that </w:t>
+      </w:r>
+      <w:r>
+        <w:rPr>
+          <w:i/>
+          <w:iCs/>
+        </w:rPr>
+        <w:t xml:space="preserve">is</w:t>
+      </w:r>
+      <w:r>
+        <w:t xml:space="preserve"> the update path). The workflow after install: register the sources in PDC (the Glossary app's bulk loader, </w:t>
+      </w:r>
+      <w:r>
+        <w:rPr>
+          <w:rFonts w:ascii="Consolas" w:hAnsi="Consolas"/>
+          <w:color w:val="0A5560"/>
+          <w:sz w:val="20"/>
+          <w:szCs w:val="20"/>
+        </w:rPr>
+        <w:t xml:space="preserve">datasources.csv</w:t>
+      </w:r>
+      <w:r>
+        <w:t xml:space="preserve">), scan → review → govern → Generate in the Glossary app (writes the Registry), then this app authors the Data Identification methods from it — the CSCU workshop walks every step with checkpoints.</w:t>
       </w:r>
     </w:p>
     <w:p>

</xml_diff>

<commit_message>
INSTALL: Windows host installs to C:\PDC-Demo (dev/test separation); docx regenerated
Co-Authored-By: Claude Fable 5 <noreply@anthropic.com>
</commit_message>
<xml_diff>
--- a/docs/lab-setup.docx
+++ b/docs/lab-setup.docx
@@ -974,7 +974,17 @@
               <w:spacing w:after="0"/>
             </w:pPr>
             <w:r>
-              <w:t xml:space="preserve">both apps — the Glossary Generator (:5000, Ollama here) and this app (:5001) — plus the vertical's courseware and domain pack</w:t>
+              <w:t xml:space="preserve">both apps — the Glossary Generator (:5000, Ollama here) and this app (:5001) — plus the vertical's courseware and domain pack, installed to </w:t>
+            </w:r>
+            <w:r>
+              <w:rPr>
+                <w:b/>
+                <w:bCs/>
+              </w:rPr>
+              <w:t xml:space="preserve">`C:\PDC-Demo`</w:t>
+            </w:r>
+            <w:r>
+              <w:t xml:space="preserve"> (kept separate from dev checkouts)</w:t>
             </w:r>
           </w:p>
         </w:tc>

</xml_diff>

<commit_message>
1.2.2: flat PDC-Demo layout - policy_generator + courseware at the top
install-pdc-demo.sh clones into a hidden .pdc-policy-generator/ and
links flat at the PDC-Demo top level: policy_generator/ beside
glossary_generator/, courseware/ (into PDC-Scenarios), and the app
README kept separate as README-Policy.md. An existing
PDC-Policy-Generator/ layout is migrated in place (mv preserves .venv).
Tested: fresh install, migration, app runs through the link, outer git
status stays clean. INSTALL.md by-hand block updated; docx regenerated.

Co-Authored-By: Claude Fable 5 <noreply@anthropic.com>
</commit_message>
<xml_diff>
--- a/docs/lab-setup.docx
+++ b/docs/lab-setup.docx
@@ -1536,6 +1536,108 @@
         <w:spacing w:after="120"/>
       </w:pPr>
       <w:r>
+        <w:t xml:space="preserve">The script produces a </w:t>
+      </w:r>
+      <w:r>
+        <w:rPr>
+          <w:b/>
+          <w:bCs/>
+        </w:rPr>
+        <w:t xml:space="preserve">flat layout</w:t>
+      </w:r>
+      <w:r>
+        <w:t xml:space="preserve">: the clone itself is hidden (</w:t>
+      </w:r>
+      <w:r>
+        <w:rPr>
+          <w:rFonts w:ascii="Consolas" w:hAnsi="Consolas"/>
+          <w:color w:val="0A5560"/>
+          <w:sz w:val="20"/>
+          <w:szCs w:val="20"/>
+        </w:rPr>
+        <w:t xml:space="preserve">.pdc-policy-generator/</w:t>
+      </w:r>
+      <w:r>
+        <w:t xml:space="preserve">), and the top level gets </w:t>
+      </w:r>
+      <w:r>
+        <w:rPr>
+          <w:rFonts w:ascii="Consolas" w:hAnsi="Consolas"/>
+          <w:color w:val="0A5560"/>
+          <w:sz w:val="20"/>
+          <w:szCs w:val="20"/>
+        </w:rPr>
+        <w:t xml:space="preserve">policy_generator/</w:t>
+      </w:r>
+      <w:r>
+        <w:t xml:space="preserve"> (a link into it, beside </w:t>
+      </w:r>
+      <w:r>
+        <w:rPr>
+          <w:rFonts w:ascii="Consolas" w:hAnsi="Consolas"/>
+          <w:color w:val="0A5560"/>
+          <w:sz w:val="20"/>
+          <w:szCs w:val="20"/>
+        </w:rPr>
+        <w:t xml:space="preserve">glossary_generator/</w:t>
+      </w:r>
+      <w:r>
+        <w:t xml:space="preserve">), </w:t>
+      </w:r>
+      <w:r>
+        <w:rPr>
+          <w:rFonts w:ascii="Consolas" w:hAnsi="Consolas"/>
+          <w:color w:val="0A5560"/>
+          <w:sz w:val="20"/>
+          <w:szCs w:val="20"/>
+        </w:rPr>
+        <w:t xml:space="preserve">courseware/</w:t>
+      </w:r>
+      <w:r>
+        <w:t xml:space="preserve"> (a link into PDC-Scenarios) and </w:t>
+      </w:r>
+      <w:r>
+        <w:rPr>
+          <w:rFonts w:ascii="Consolas" w:hAnsi="Consolas"/>
+          <w:color w:val="0A5560"/>
+          <w:sz w:val="20"/>
+          <w:szCs w:val="20"/>
+        </w:rPr>
+        <w:t xml:space="preserve">README-Policy.md</w:t>
+      </w:r>
+      <w:r>
+        <w:t xml:space="preserve"> (this repo's README, kept separate from the Glossary one). An older </w:t>
+      </w:r>
+      <w:r>
+        <w:rPr>
+          <w:rFonts w:ascii="Consolas" w:hAnsi="Consolas"/>
+          <w:color w:val="0A5560"/>
+          <w:sz w:val="20"/>
+          <w:szCs w:val="20"/>
+        </w:rPr>
+        <w:t xml:space="preserve">PDC-Policy-Generator/</w:t>
+      </w:r>
+      <w:r>
+        <w:t xml:space="preserve"> layout is migrated in place on the next run. Updating is </w:t>
+      </w:r>
+      <w:r>
+        <w:rPr>
+          <w:rFonts w:ascii="Consolas" w:hAnsi="Consolas"/>
+          <w:color w:val="0A5560"/>
+          <w:sz w:val="20"/>
+          <w:szCs w:val="20"/>
+        </w:rPr>
+        <w:t xml:space="preserve">git -C ~/PDC-Demo/.pdc-policy-generator pull</w:t>
+      </w:r>
+      <w:r>
+        <w:t xml:space="preserve"> — or just re-run the script.</w:t>
+      </w:r>
+    </w:p>
+    <w:p>
+      <w:pPr>
+        <w:spacing w:after="120"/>
+      </w:pPr>
+      <w:r>
         <w:rPr>
           <w:b/>
           <w:bCs/>
@@ -1581,7 +1683,7 @@
           <w:szCs w:val="19"/>
           <w:color w:val="0A3D52"/>
         </w:rPr>
-        <w:t xml:space="preserve">git clone https://github.com/jporeilly/PDC-Policy-Generator.git</w:t>
+        <w:t xml:space="preserve">git clone --filter=blob:none --sparse https://github.com/jporeilly/PDC-Policy-Generator.git .pdc-policy-generator</w:t>
       </w:r>
     </w:p>
     <w:p>
@@ -1600,7 +1702,7 @@
           <w:szCs w:val="19"/>
           <w:color w:val="0A3D52"/>
         </w:rPr>
-        <w:t xml:space="preserve">echo "PDC-Policy-Generator/" &gt;&gt; .git/info/exclude   # keep the Glossary repo's `git status` clean</w:t>
+        <w:t xml:space="preserve">git -C .pdc-policy-generator sparse-checkout set policy_generator</w:t>
       </w:r>
     </w:p>
     <w:p>
@@ -1619,7 +1721,64 @@
           <w:szCs w:val="19"/>
           <w:color w:val="0A3D52"/>
         </w:rPr>
-        <w:t xml:space="preserve">cd PDC-Policy-Generator/policy_generator</w:t>
+        <w:t xml:space="preserve">ln -s .pdc-policy-generator/policy_generator policy_generator</w:t>
+      </w:r>
+    </w:p>
+    <w:p>
+      <w:pPr>
+        <w:pBdr>
+          <w:left w:val="single" w:sz="12" w:space="8" w:color="1C7293"/>
+        </w:pBdr>
+        <w:shd w:val="clear" w:color="auto" w:fill="F4F7F9"/>
+        <w:spacing w:before="0" w:after="0"/>
+        <w:ind w:left="240"/>
+      </w:pPr>
+      <w:r>
+        <w:rPr>
+          <w:rFonts w:ascii="Consolas" w:hAnsi="Consolas"/>
+          <w:sz w:val="19"/>
+          <w:szCs w:val="19"/>
+          <w:color w:val="0A3D52"/>
+        </w:rPr>
+        <w:t xml:space="preserve">printf '%s</w:t>
+      </w:r>
+    </w:p>
+    <w:p>
+      <w:pPr>
+        <w:pBdr>
+          <w:left w:val="single" w:sz="12" w:space="8" w:color="1C7293"/>
+        </w:pBdr>
+        <w:shd w:val="clear" w:color="auto" w:fill="F4F7F9"/>
+        <w:spacing w:before="0" w:after="0"/>
+        <w:ind w:left="240"/>
+      </w:pPr>
+      <w:r>
+        <w:rPr>
+          <w:rFonts w:ascii="Consolas" w:hAnsi="Consolas"/>
+          <w:sz w:val="19"/>
+          <w:szCs w:val="19"/>
+          <w:color w:val="0A3D52"/>
+        </w:rPr>
+        <w:t xml:space="preserve">' '.pdc-policy-generator/' 'policy_generator' &gt;&gt; .git/info/exclude</w:t>
+      </w:r>
+    </w:p>
+    <w:p>
+      <w:pPr>
+        <w:pBdr>
+          <w:left w:val="single" w:sz="12" w:space="8" w:color="1C7293"/>
+        </w:pBdr>
+        <w:shd w:val="clear" w:color="auto" w:fill="F4F7F9"/>
+        <w:spacing w:before="0" w:after="0"/>
+        <w:ind w:left="240"/>
+      </w:pPr>
+      <w:r>
+        <w:rPr>
+          <w:rFonts w:ascii="Consolas" w:hAnsi="Consolas"/>
+          <w:sz w:val="19"/>
+          <w:szCs w:val="19"/>
+          <w:color w:val="0A3D52"/>
+        </w:rPr>
+        <w:t xml:space="preserve">cd policy_generator</w:t>
       </w:r>
     </w:p>
     <w:p>
@@ -1639,26 +1798,6 @@
           <w:color w:val="0A3D52"/>
         </w:rPr>
         <w:t xml:space="preserve">bash run.sh --host 0.0.0.0        # VM checkouts may lack exec bits — bash, not ./</w:t>
-      </w:r>
-    </w:p>
-    <w:p>
-      <w:pPr>
-        <w:spacing w:after="120"/>
-      </w:pPr>
-      <w:r>
-        <w:t xml:space="preserve">(Already cloned? </w:t>
-      </w:r>
-      <w:r>
-        <w:rPr>
-          <w:rFonts w:ascii="Consolas" w:hAnsi="Consolas"/>
-          <w:color w:val="0A5560"/>
-          <w:sz w:val="20"/>
-          <w:szCs w:val="20"/>
-        </w:rPr>
-        <w:t xml:space="preserve">git -C ~/PDC-Demo/PDC-Policy-Generator pull</w:t>
-      </w:r>
-      <w:r>
-        <w:t xml:space="preserve"> — or just re-run the script.)</w:t>
       </w:r>
     </w:p>
     <w:p>

</xml_diff>

<commit_message>
1.4.5: diagram pipeline - live mermaid in markdown, rendered PNGs in docx
CONTRACT.md + INSTALL.md mermaid diagrams (with README's pair: six
total, all mermaid-cli validated). render-diagrams.py regenerates each
diagram's canonical PNG in images/ from the live blocks (2x, white bg)
so they never drift; build-docx.py now embeds mermaid fences as those
PNGs in lab-setup.docx instead of leaking raw diagram source (Word-COM
verified, 2 inline images). Image audit: every markdown image reference
across the three repos resolves.

Co-Authored-By: Claude Fable 5 <noreply@anthropic.com>
</commit_message>
<xml_diff>
--- a/docs/lab-setup.docx
+++ b/docs/lab-setup.docx
@@ -1141,6 +1141,45 @@
     </w:p>
     <w:p>
       <w:pPr>
+        <w:jc w:val="center"/>
+        <w:spacing w:before="120" w:after="160"/>
+      </w:pPr>
+      <w:r>
+        <w:drawing>
+          <wp:inline xmlns:wp="http://schemas.openxmlformats.org/drawingml/2006/wordprocessingDrawing" distT="0" distB="0" distL="0" distR="0">
+            <wp:extent cx="5760720" cy="3152230"/>
+            <wp:docPr id="200" name="install-topology-preview"/>
+            <a:graphic xmlns:a="http://schemas.openxmlformats.org/drawingml/2006/main">
+              <a:graphicData uri="http://schemas.openxmlformats.org/drawingml/2006/picture">
+                <pic:pic xmlns:pic="http://schemas.openxmlformats.org/drawingml/2006/picture">
+                  <pic:nvPicPr>
+                    <pic:cNvPr id="200" name="install-topology-preview"/>
+                    <pic:cNvPicPr/>
+                  </pic:nvPicPr>
+                  <pic:blipFill>
+                    <a:blip r:embed="rId200"/>
+                    <a:stretch>
+                      <a:fillRect/>
+                    </a:stretch>
+                  </pic:blipFill>
+                  <pic:spPr>
+                    <a:xfrm>
+                      <a:off x="0" y="0"/>
+                      <a:ext cx="5760720" cy="3152230"/>
+                    </a:xfrm>
+                    <a:prstGeom prst="rect">
+                      <a:avLst/>
+                    </a:prstGeom>
+                  </pic:spPr>
+                </pic:pic>
+              </a:graphicData>
+            </a:graphic>
+          </wp:inline>
+        </w:drawing>
+      </w:r>
+    </w:p>
+    <w:p>
+      <w:pPr>
         <w:spacing w:after="120"/>
       </w:pPr>
       <w:r>
@@ -1167,6 +1206,57 @@
       </w:r>
       <w:r>
         <w:t xml:space="preserve">), scan → review → govern → Generate in the Glossary app (writes the Registry), then this app authors the Data Identification methods from it — the CSCU workshop walks every step with checkpoints.</w:t>
+      </w:r>
+    </w:p>
+    <w:p>
+      <w:pPr>
+        <w:jc w:val="center"/>
+        <w:spacing w:before="120" w:after="160"/>
+      </w:pPr>
+      <w:r>
+        <w:drawing>
+          <wp:inline xmlns:wp="http://schemas.openxmlformats.org/drawingml/2006/wordprocessingDrawing" distT="0" distB="0" distL="0" distR="0">
+            <wp:extent cx="5760720" cy="382088"/>
+            <wp:docPr id="201" name="install-workflow-preview"/>
+            <a:graphic xmlns:a="http://schemas.openxmlformats.org/drawingml/2006/main">
+              <a:graphicData uri="http://schemas.openxmlformats.org/drawingml/2006/picture">
+                <pic:pic xmlns:pic="http://schemas.openxmlformats.org/drawingml/2006/picture">
+                  <pic:nvPicPr>
+                    <pic:cNvPr id="201" name="install-workflow-preview"/>
+                    <pic:cNvPicPr/>
+                  </pic:nvPicPr>
+                  <pic:blipFill>
+                    <a:blip r:embed="rId201"/>
+                    <a:stretch>
+                      <a:fillRect/>
+                    </a:stretch>
+                  </pic:blipFill>
+                  <pic:spPr>
+                    <a:xfrm>
+                      <a:off x="0" y="0"/>
+                      <a:ext cx="5760720" cy="382088"/>
+                    </a:xfrm>
+                    <a:prstGeom prst="rect">
+                      <a:avLst/>
+                    </a:prstGeom>
+                  </pic:spPr>
+                </pic:pic>
+              </a:graphicData>
+            </a:graphic>
+          </wp:inline>
+        </w:drawing>
+      </w:r>
+    </w:p>
+    <w:p>
+      <w:pPr>
+        <w:spacing w:after="120"/>
+      </w:pPr>
+      <w:r>
+        <w:rPr>
+          <w:i/>
+          <w:iCs/>
+        </w:rPr>
+        <w:t xml:space="preserve">Gray = one-time lab install &amp;middot; blue = Glossary Generator &amp;middot; amber = this app &amp;middot; outlined = steps performed in PDC. The CSCU workshop walks every step with checkpoints.</w:t>
       </w:r>
     </w:p>
     <w:p>

</xml_diff>

<commit_message>
INSTALL: Windows 11 host first-run + update steps; regenerate lab-setup.docx
Step-by-step winget prerequisites, clone + UI build, run.ps1 launch,
verify; plus the post-port update sequence (git pull, conditional
frontend rebuild, auto-reinstalling launcher). run.ps1 verified
end-to-end on a Windows 11 host (fresh venv -> deps -> uvicorn).

Co-Authored-By: Claude Fable 5 <noreply@anthropic.com>
</commit_message>
<xml_diff>
--- a/docs/lab-setup.docx
+++ b/docs/lab-setup.docx
@@ -266,7 +266,7 @@
         <w:spacing w:after="60"/>
       </w:pPr>
       <w:r>
-        <w:t xml:space="preserve">The offline selftest passing (20 checks, no PDC, no network).</w:t>
+        <w:t xml:space="preserve">The offline pytest suite passing (20 tests, no PDC, no network).</w:t>
       </w:r>
     </w:p>
     <w:p>
@@ -1522,7 +1522,7 @@
         <w:t xml:space="preserve">git status</w:t>
       </w:r>
       <w:r>
-        <w:t xml:space="preserve">, and runs the selftest. Pass a vertical (</w:t>
+        <w:t xml:space="preserve">, and runs the tests. Pass a vertical (</w:t>
       </w:r>
       <w:r>
         <w:rPr>
@@ -2139,7 +2139,7 @@
               <w:t xml:space="preserve">author.py</w:t>
             </w:r>
             <w:r>
-              <w:t xml:space="preserve">), CLI, web UI (</w:t>
+              <w:t xml:space="preserve">, </w:t>
             </w:r>
             <w:r>
               <w:rPr>
@@ -2148,10 +2148,10 @@
                 <w:sz w:val="20"/>
                 <w:szCs w:val="20"/>
               </w:rPr>
-              <w:t xml:space="preserve">app.py</w:t>
-            </w:r>
-            <w:r>
-              <w:t xml:space="preserve"> + </w:t>
+              <w:t xml:space="preserve">pdc.py</w:t>
+            </w:r>
+            <w:r>
+              <w:t xml:space="preserve">), CLI, FastAPI web layer (</w:t>
             </w:r>
             <w:r>
               <w:rPr>
@@ -2160,7 +2160,7 @@
                 <w:sz w:val="20"/>
                 <w:szCs w:val="20"/>
               </w:rPr>
-              <w:t xml:space="preserve">templates/</w:t>
+              <w:t xml:space="preserve">api.py</w:t>
             </w:r>
             <w:r>
               <w:t xml:space="preserve">), launchers, </w:t>
@@ -2199,7 +2199,7 @@
                 <w:sz w:val="20"/>
                 <w:szCs w:val="20"/>
               </w:rPr>
-              <w:t xml:space="preserve">docs/CONTRACT.md</w:t>
+              <w:t xml:space="preserve">frontend/</w:t>
             </w:r>
           </w:p>
         </w:tc>
@@ -2218,7 +2218,7 @@
               <w:spacing w:after="0"/>
             </w:pPr>
             <w:r>
-              <w:t xml:space="preserve">the </w:t>
+              <w:t xml:space="preserve">the React (Vite) UI — the API serves </w:t>
             </w:r>
             <w:r>
               <w:rPr>
@@ -2227,10 +2227,22 @@
                 <w:sz w:val="20"/>
                 <w:szCs w:val="20"/>
               </w:rPr>
-              <w:t xml:space="preserve">classification-registry/1</w:t>
-            </w:r>
-            <w:r>
-              <w:t xml:space="preserve"> schema, field by field</w:t>
+              <w:t xml:space="preserve">frontend/dist</w:t>
+            </w:r>
+            <w:r>
+              <w:t xml:space="preserve">; build once with </w:t>
+            </w:r>
+            <w:r>
+              <w:rPr>
+                <w:rFonts w:ascii="Consolas" w:hAnsi="Consolas"/>
+                <w:color w:val="0A5560"/>
+                <w:sz w:val="20"/>
+                <w:szCs w:val="20"/>
+              </w:rPr>
+              <w:t xml:space="preserve">npm install &amp;&amp; npm run build</w:t>
+            </w:r>
+            <w:r>
+              <w:t xml:space="preserve"> (Node 18+)</w:t>
             </w:r>
           </w:p>
         </w:tc>
@@ -2257,7 +2269,7 @@
                 <w:sz w:val="20"/>
                 <w:szCs w:val="20"/>
               </w:rPr>
-              <w:t xml:space="preserve">docs/CHANGELOG.md</w:t>
+              <w:t xml:space="preserve">tests/</w:t>
             </w:r>
           </w:p>
         </w:tc>
@@ -2276,19 +2288,7 @@
               <w:spacing w:after="0"/>
             </w:pPr>
             <w:r>
-              <w:t xml:space="preserve">version history (the app version lives in </w:t>
-            </w:r>
-            <w:r>
-              <w:rPr>
-                <w:rFonts w:ascii="Consolas" w:hAnsi="Consolas"/>
-                <w:color w:val="0A5560"/>
-                <w:sz w:val="20"/>
-                <w:szCs w:val="20"/>
-              </w:rPr>
-              <w:t xml:space="preserve">policy_generator/VERSION</w:t>
-            </w:r>
-            <w:r>
-              <w:t xml:space="preserve">)</w:t>
+              <w:t xml:space="preserve">pytest suite: engine invariants, API flows (PDC mocked), docs-consistency</w:t>
             </w:r>
           </w:p>
         </w:tc>
@@ -2315,7 +2315,7 @@
                 <w:sz w:val="20"/>
                 <w:szCs w:val="20"/>
               </w:rPr>
-              <w:t xml:space="preserve">docs/tools/</w:t>
+              <w:t xml:space="preserve">docs/CONTRACT.md</w:t>
             </w:r>
           </w:p>
         </w:tc>
@@ -2334,7 +2334,7 @@
               <w:spacing w:after="0"/>
             </w:pPr>
             <w:r>
-              <w:t xml:space="preserve">the Word-guide builder that regenerates </w:t>
+              <w:t xml:space="preserve">the </w:t>
             </w:r>
             <w:r>
               <w:rPr>
@@ -2343,22 +2343,10 @@
                 <w:sz w:val="20"/>
                 <w:szCs w:val="20"/>
               </w:rPr>
-              <w:t xml:space="preserve">docs/lab-setup.docx</w:t>
-            </w:r>
-            <w:r>
-              <w:t xml:space="preserve"> (the workshops live in the PDC-Scenarios repo under </w:t>
-            </w:r>
-            <w:r>
-              <w:rPr>
-                <w:rFonts w:ascii="Consolas" w:hAnsi="Consolas"/>
-                <w:color w:val="0A5560"/>
-                <w:sz w:val="20"/>
-                <w:szCs w:val="20"/>
-              </w:rPr>
-              <w:t xml:space="preserve">courseware/&lt;ID&gt;/Policy/</w:t>
-            </w:r>
-            <w:r>
-              <w:t xml:space="preserve">)</w:t>
+              <w:t xml:space="preserve">classification-registry/1</w:t>
+            </w:r>
+            <w:r>
+              <w:t xml:space="preserve"> schema, field by field</w:t>
             </w:r>
           </w:p>
         </w:tc>
@@ -2385,7 +2373,7 @@
                 <w:sz w:val="20"/>
                 <w:szCs w:val="20"/>
               </w:rPr>
-              <w:t xml:space="preserve">docs/INSTALL.md</w:t>
+              <w:t xml:space="preserve">CHANGELOG.md</w:t>
             </w:r>
           </w:p>
         </w:tc>
@@ -2404,7 +2392,65 @@
               <w:spacing w:after="0"/>
             </w:pPr>
             <w:r>
-              <w:t xml:space="preserve">this guide — the markdown master </w:t>
+              <w:t xml:space="preserve">version history at the repo root (the runtime version lives in </w:t>
+            </w:r>
+            <w:r>
+              <w:rPr>
+                <w:rFonts w:ascii="Consolas" w:hAnsi="Consolas"/>
+                <w:color w:val="0A5560"/>
+                <w:sz w:val="20"/>
+                <w:szCs w:val="20"/>
+              </w:rPr>
+              <w:t xml:space="preserve">policy_generator/VERSION</w:t>
+            </w:r>
+            <w:r>
+              <w:t xml:space="preserve">)</w:t>
+            </w:r>
+          </w:p>
+        </w:tc>
+      </w:tr>
+      <w:tr>
+        <w:tc>
+          <w:tcPr>
+            <w:tcW w:w="2900" w:type="dxa"/>
+            <w:tcMar>
+              <w:top w:w="120" w:type="dxa"/>
+              <w:left w:w="180" w:type="dxa"/>
+              <w:bottom w:w="120" w:type="dxa"/>
+              <w:right w:w="180" w:type="dxa"/>
+            </w:tcMar>
+          </w:tcPr>
+          <w:p>
+            <w:pPr>
+              <w:spacing w:after="0"/>
+            </w:pPr>
+            <w:r>
+              <w:rPr>
+                <w:rFonts w:ascii="Consolas" w:hAnsi="Consolas"/>
+                <w:color w:val="0A5560"/>
+                <w:sz w:val="20"/>
+                <w:szCs w:val="20"/>
+              </w:rPr>
+              <w:t xml:space="preserve">docs/tools/</w:t>
+            </w:r>
+          </w:p>
+        </w:tc>
+        <w:tc>
+          <w:tcPr>
+            <w:tcW w:w="6460" w:type="dxa"/>
+            <w:tcMar>
+              <w:top w:w="120" w:type="dxa"/>
+              <w:left w:w="180" w:type="dxa"/>
+              <w:bottom w:w="120" w:type="dxa"/>
+              <w:right w:w="180" w:type="dxa"/>
+            </w:tcMar>
+          </w:tcPr>
+          <w:p>
+            <w:pPr>
+              <w:spacing w:after="0"/>
+            </w:pPr>
+            <w:r>
+              <w:t xml:space="preserve">the Word-guide builder that regenerates </w:t>
             </w:r>
             <w:r>
               <w:rPr>
@@ -2416,6 +2462,76 @@
               <w:t xml:space="preserve">docs/lab-setup.docx</w:t>
             </w:r>
             <w:r>
+              <w:t xml:space="preserve"> (the workshops live in the PDC-Scenarios repo under </w:t>
+            </w:r>
+            <w:r>
+              <w:rPr>
+                <w:rFonts w:ascii="Consolas" w:hAnsi="Consolas"/>
+                <w:color w:val="0A5560"/>
+                <w:sz w:val="20"/>
+                <w:szCs w:val="20"/>
+              </w:rPr>
+              <w:t xml:space="preserve">courseware/&lt;ID&gt;/Policy/</w:t>
+            </w:r>
+            <w:r>
+              <w:t xml:space="preserve">)</w:t>
+            </w:r>
+          </w:p>
+        </w:tc>
+      </w:tr>
+      <w:tr>
+        <w:tc>
+          <w:tcPr>
+            <w:tcW w:w="2900" w:type="dxa"/>
+            <w:tcMar>
+              <w:top w:w="120" w:type="dxa"/>
+              <w:left w:w="180" w:type="dxa"/>
+              <w:bottom w:w="120" w:type="dxa"/>
+              <w:right w:w="180" w:type="dxa"/>
+            </w:tcMar>
+          </w:tcPr>
+          <w:p>
+            <w:pPr>
+              <w:spacing w:after="0"/>
+            </w:pPr>
+            <w:r>
+              <w:rPr>
+                <w:rFonts w:ascii="Consolas" w:hAnsi="Consolas"/>
+                <w:color w:val="0A5560"/>
+                <w:sz w:val="20"/>
+                <w:szCs w:val="20"/>
+              </w:rPr>
+              <w:t xml:space="preserve">docs/INSTALL.md</w:t>
+            </w:r>
+          </w:p>
+        </w:tc>
+        <w:tc>
+          <w:tcPr>
+            <w:tcW w:w="6460" w:type="dxa"/>
+            <w:tcMar>
+              <w:top w:w="120" w:type="dxa"/>
+              <w:left w:w="180" w:type="dxa"/>
+              <w:bottom w:w="120" w:type="dxa"/>
+              <w:right w:w="180" w:type="dxa"/>
+            </w:tcMar>
+          </w:tcPr>
+          <w:p>
+            <w:pPr>
+              <w:spacing w:after="0"/>
+            </w:pPr>
+            <w:r>
+              <w:t xml:space="preserve">this guide — the markdown master </w:t>
+            </w:r>
+            <w:r>
+              <w:rPr>
+                <w:rFonts w:ascii="Consolas" w:hAnsi="Consolas"/>
+                <w:color w:val="0A5560"/>
+                <w:sz w:val="20"/>
+                <w:szCs w:val="20"/>
+              </w:rPr>
+              <w:t xml:space="preserve">docs/lab-setup.docx</w:t>
+            </w:r>
+            <w:r>
               <w:t xml:space="preserve"> is generated from</w:t>
             </w:r>
           </w:p>
@@ -2452,7 +2568,7 @@
         <w:t xml:space="preserve">.venv</w:t>
       </w:r>
       <w:r>
-        <w:t xml:space="preserve">), installs the (Flask-only) dependencies — re-installing only when </w:t>
+        <w:t xml:space="preserve">), installs the dependencies (fastapi + uvicorn — the engine itself is stdlib-only), re-installing only when </w:t>
       </w:r>
       <w:r>
         <w:rPr>
@@ -2464,7 +2580,31 @@
         <w:t xml:space="preserve">requirements.txt</w:t>
       </w:r>
       <w:r>
-        <w:t xml:space="preserve"> changes — and starts the app. Nothing touches your system Python.</w:t>
+        <w:t xml:space="preserve"> changes, and starts the app. Nothing touches your system Python. If the React UI isn't built yet the launcher says so and the API + interactive docs (</w:t>
+      </w:r>
+      <w:r>
+        <w:rPr>
+          <w:rFonts w:ascii="Consolas" w:hAnsi="Consolas"/>
+          <w:color w:val="0A5560"/>
+          <w:sz w:val="20"/>
+          <w:szCs w:val="20"/>
+        </w:rPr>
+        <w:t xml:space="preserve">/docs</w:t>
+      </w:r>
+      <w:r>
+        <w:t xml:space="preserve">) still work; build the UI once with </w:t>
+      </w:r>
+      <w:r>
+        <w:rPr>
+          <w:rFonts w:ascii="Consolas" w:hAnsi="Consolas"/>
+          <w:color w:val="0A5560"/>
+          <w:sz w:val="20"/>
+          <w:szCs w:val="20"/>
+        </w:rPr>
+        <w:t xml:space="preserve">cd frontend &amp;&amp; npm install &amp;&amp; npm run build</w:t>
+      </w:r>
+      <w:r>
+        <w:t xml:space="preserve">.</w:t>
       </w:r>
     </w:p>
     <w:p>
@@ -2665,6 +2805,460 @@
       </w:r>
       <w:r>
         <w:t xml:space="preserve"> and confirm the banner shows the app version.</w:t>
+      </w:r>
+    </w:p>
+    <w:p>
+      <w:pPr>
+        <w:pStyle w:val="Heading2"/>
+      </w:pPr>
+      <w:r>
+        <w:t xml:space="preserve">Windows 11 host — first run, step by step</w:t>
+      </w:r>
+    </w:p>
+    <w:p>
+      <w:pPr>
+        <w:spacing w:after="120"/>
+      </w:pPr>
+      <w:r>
+        <w:t xml:space="preserve">Everything below runs in a normal PowerShell window (no admin needed).</w:t>
+      </w:r>
+    </w:p>
+    <w:p>
+      <w:pPr>
+        <w:pStyle w:val="ListParagraph"/>
+        <w:numPr>
+          <w:ilvl w:val="0"/>
+          <w:numId w:val="100"/>
+        </w:numPr>
+        <w:spacing w:after="80" w:line="264" w:lineRule="auto"/>
+      </w:pPr>
+      <w:r>
+        <w:rPr>
+          <w:b/>
+          <w:bCs/>
+        </w:rPr>
+        <w:t xml:space="preserve">Prerequisites</w:t>
+      </w:r>
+      <w:r>
+        <w:t xml:space="preserve"> (once per machine):</w:t>
+      </w:r>
+    </w:p>
+    <w:p>
+      <w:pPr>
+        <w:pBdr>
+          <w:left w:val="single" w:sz="12" w:space="8" w:color="1C7293"/>
+        </w:pBdr>
+        <w:shd w:val="clear" w:color="auto" w:fill="F4F7F9"/>
+        <w:spacing w:before="0" w:after="0"/>
+        <w:ind w:left="240"/>
+      </w:pPr>
+      <w:r>
+        <w:rPr>
+          <w:rFonts w:ascii="Consolas" w:hAnsi="Consolas"/>
+          <w:sz w:val="19"/>
+          <w:szCs w:val="19"/>
+          <w:color w:val="0A3D52"/>
+        </w:rPr>
+        <w:t xml:space="preserve">   winget install Python.Python.3.12     # or 3.13 from python.org — tick "Add to PATH"</w:t>
+      </w:r>
+    </w:p>
+    <w:p>
+      <w:pPr>
+        <w:pBdr>
+          <w:left w:val="single" w:sz="12" w:space="8" w:color="1C7293"/>
+        </w:pBdr>
+        <w:shd w:val="clear" w:color="auto" w:fill="F4F7F9"/>
+        <w:spacing w:before="0" w:after="0"/>
+        <w:ind w:left="240"/>
+      </w:pPr>
+      <w:r>
+        <w:rPr>
+          <w:rFonts w:ascii="Consolas" w:hAnsi="Consolas"/>
+          <w:sz w:val="19"/>
+          <w:szCs w:val="19"/>
+          <w:color w:val="0A3D52"/>
+        </w:rPr>
+        <w:t xml:space="preserve">   winget install OpenJS.NodeJS.LTS      # Node 18+ (builds the React UI)</w:t>
+      </w:r>
+    </w:p>
+    <w:p>
+      <w:pPr>
+        <w:pBdr>
+          <w:left w:val="single" w:sz="12" w:space="8" w:color="1C7293"/>
+        </w:pBdr>
+        <w:shd w:val="clear" w:color="auto" w:fill="F4F7F9"/>
+        <w:spacing w:before="0" w:after="120"/>
+        <w:ind w:left="240"/>
+      </w:pPr>
+      <w:r>
+        <w:rPr>
+          <w:rFonts w:ascii="Consolas" w:hAnsi="Consolas"/>
+          <w:sz w:val="19"/>
+          <w:szCs w:val="19"/>
+          <w:color w:val="0A3D52"/>
+        </w:rPr>
+        <w:t xml:space="preserve">   winget install Git.Git                # if git isn't installed yet</w:t>
+      </w:r>
+    </w:p>
+    <w:p>
+      <w:pPr>
+        <w:spacing w:after="120"/>
+      </w:pPr>
+      <w:r>
+        <w:t xml:space="preserve">Close and reopen PowerShell afterwards so PATH updates take effect.</w:t>
+      </w:r>
+    </w:p>
+    <w:p>
+      <w:pPr>
+        <w:pStyle w:val="ListParagraph"/>
+        <w:numPr>
+          <w:ilvl w:val="0"/>
+          <w:numId w:val="101"/>
+        </w:numPr>
+        <w:spacing w:after="80" w:line="264" w:lineRule="auto"/>
+      </w:pPr>
+      <w:r>
+        <w:rPr>
+          <w:b/>
+          <w:bCs/>
+        </w:rPr>
+        <w:t xml:space="preserve">Clone and build the UI</w:t>
+      </w:r>
+      <w:r>
+        <w:t xml:space="preserve"> (once per checkout):</w:t>
+      </w:r>
+    </w:p>
+    <w:p>
+      <w:pPr>
+        <w:pBdr>
+          <w:left w:val="single" w:sz="12" w:space="8" w:color="1C7293"/>
+        </w:pBdr>
+        <w:shd w:val="clear" w:color="auto" w:fill="F4F7F9"/>
+        <w:spacing w:before="0" w:after="0"/>
+        <w:ind w:left="240"/>
+      </w:pPr>
+      <w:r>
+        <w:rPr>
+          <w:rFonts w:ascii="Consolas" w:hAnsi="Consolas"/>
+          <w:sz w:val="19"/>
+          <w:szCs w:val="19"/>
+          <w:color w:val="0A3D52"/>
+        </w:rPr>
+        <w:t xml:space="preserve">   git clone https://github.com/jporeilly/PDC-Policy-Generator.git</w:t>
+      </w:r>
+    </w:p>
+    <w:p>
+      <w:pPr>
+        <w:pBdr>
+          <w:left w:val="single" w:sz="12" w:space="8" w:color="1C7293"/>
+        </w:pBdr>
+        <w:shd w:val="clear" w:color="auto" w:fill="F4F7F9"/>
+        <w:spacing w:before="0" w:after="0"/>
+        <w:ind w:left="240"/>
+      </w:pPr>
+      <w:r>
+        <w:rPr>
+          <w:rFonts w:ascii="Consolas" w:hAnsi="Consolas"/>
+          <w:sz w:val="19"/>
+          <w:szCs w:val="19"/>
+          <w:color w:val="0A3D52"/>
+        </w:rPr>
+        <w:t xml:space="preserve">   cd PDC-Policy-Generator\frontend</w:t>
+      </w:r>
+    </w:p>
+    <w:p>
+      <w:pPr>
+        <w:pBdr>
+          <w:left w:val="single" w:sz="12" w:space="8" w:color="1C7293"/>
+        </w:pBdr>
+        <w:shd w:val="clear" w:color="auto" w:fill="F4F7F9"/>
+        <w:spacing w:before="0" w:after="0"/>
+        <w:ind w:left="240"/>
+      </w:pPr>
+      <w:r>
+        <w:rPr>
+          <w:rFonts w:ascii="Consolas" w:hAnsi="Consolas"/>
+          <w:sz w:val="19"/>
+          <w:szCs w:val="19"/>
+          <w:color w:val="0A3D52"/>
+        </w:rPr>
+        <w:t xml:space="preserve">   npm install</w:t>
+      </w:r>
+    </w:p>
+    <w:p>
+      <w:pPr>
+        <w:pBdr>
+          <w:left w:val="single" w:sz="12" w:space="8" w:color="1C7293"/>
+        </w:pBdr>
+        <w:shd w:val="clear" w:color="auto" w:fill="F4F7F9"/>
+        <w:spacing w:before="0" w:after="120"/>
+        <w:ind w:left="240"/>
+      </w:pPr>
+      <w:r>
+        <w:rPr>
+          <w:rFonts w:ascii="Consolas" w:hAnsi="Consolas"/>
+          <w:sz w:val="19"/>
+          <w:szCs w:val="19"/>
+          <w:color w:val="0A3D52"/>
+        </w:rPr>
+        <w:t xml:space="preserve">   npm run build                         # produces frontend\dist — the UI the API serves</w:t>
+      </w:r>
+    </w:p>
+    <w:p>
+      <w:pPr>
+        <w:pStyle w:val="ListParagraph"/>
+        <w:numPr>
+          <w:ilvl w:val="0"/>
+          <w:numId w:val="102"/>
+        </w:numPr>
+        <w:spacing w:after="80" w:line="264" w:lineRule="auto"/>
+      </w:pPr>
+      <w:r>
+        <w:rPr>
+          <w:b/>
+          <w:bCs/>
+        </w:rPr>
+        <w:t xml:space="preserve">Launch</w:t>
+      </w:r>
+      <w:r>
+        <w:t xml:space="preserve">:</w:t>
+      </w:r>
+    </w:p>
+    <w:p>
+      <w:pPr>
+        <w:pBdr>
+          <w:left w:val="single" w:sz="12" w:space="8" w:color="1C7293"/>
+        </w:pBdr>
+        <w:shd w:val="clear" w:color="auto" w:fill="F4F7F9"/>
+        <w:spacing w:before="0" w:after="0"/>
+        <w:ind w:left="240"/>
+      </w:pPr>
+      <w:r>
+        <w:rPr>
+          <w:rFonts w:ascii="Consolas" w:hAnsi="Consolas"/>
+          <w:sz w:val="19"/>
+          <w:szCs w:val="19"/>
+          <w:color w:val="0A3D52"/>
+        </w:rPr>
+        <w:t xml:space="preserve">   cd ..\policy_generator</w:t>
+      </w:r>
+    </w:p>
+    <w:p>
+      <w:pPr>
+        <w:pBdr>
+          <w:left w:val="single" w:sz="12" w:space="8" w:color="1C7293"/>
+        </w:pBdr>
+        <w:shd w:val="clear" w:color="auto" w:fill="F4F7F9"/>
+        <w:spacing w:before="0" w:after="120"/>
+        <w:ind w:left="240"/>
+      </w:pPr>
+      <w:r>
+        <w:rPr>
+          <w:rFonts w:ascii="Consolas" w:hAnsi="Consolas"/>
+          <w:sz w:val="19"/>
+          <w:szCs w:val="19"/>
+          <w:color w:val="0A3D52"/>
+        </w:rPr>
+        <w:t xml:space="preserve">   .\run.ps1                             # or double-click run.bat</w:t>
+      </w:r>
+    </w:p>
+    <w:p>
+      <w:pPr>
+        <w:spacing w:after="120"/>
+      </w:pPr>
+      <w:r>
+        <w:t xml:space="preserve">First run builds a local </w:t>
+      </w:r>
+      <w:r>
+        <w:rPr>
+          <w:rFonts w:ascii="Consolas" w:hAnsi="Consolas"/>
+          <w:color w:val="0A5560"/>
+          <w:sz w:val="20"/>
+          <w:szCs w:val="20"/>
+        </w:rPr>
+        <w:t xml:space="preserve">.venv</w:t>
+      </w:r>
+      <w:r>
+        <w:t xml:space="preserve"> and installs the dependencies (~1 minute); repeat runs skip that and start immediately. If scripts are blocked: </w:t>
+      </w:r>
+      <w:r>
+        <w:rPr>
+          <w:rFonts w:ascii="Consolas" w:hAnsi="Consolas"/>
+          <w:color w:val="0A5560"/>
+          <w:sz w:val="20"/>
+          <w:szCs w:val="20"/>
+        </w:rPr>
+        <w:t xml:space="preserve">powershell -ExecutionPolicy Bypass -File .\run.ps1</w:t>
+      </w:r>
+      <w:r>
+        <w:t xml:space="preserve">.</w:t>
+      </w:r>
+    </w:p>
+    <w:p>
+      <w:pPr>
+        <w:pStyle w:val="ListParagraph"/>
+        <w:numPr>
+          <w:ilvl w:val="0"/>
+          <w:numId w:val="103"/>
+        </w:numPr>
+        <w:spacing w:after="80" w:line="264" w:lineRule="auto"/>
+      </w:pPr>
+      <w:r>
+        <w:rPr>
+          <w:b/>
+          <w:bCs/>
+        </w:rPr>
+        <w:t xml:space="preserve">Verify</w:t>
+      </w:r>
+      <w:r>
+        <w:t xml:space="preserve">: open </w:t>
+      </w:r>
+      <w:r>
+        <w:rPr>
+          <w:rFonts w:ascii="Consolas" w:hAnsi="Consolas"/>
+          <w:color w:val="0A5560"/>
+          <w:sz w:val="20"/>
+          <w:szCs w:val="20"/>
+        </w:rPr>
+        <w:t xml:space="preserve">http://127.0.0.1:5001</w:t>
+      </w:r>
+      <w:r>
+        <w:t xml:space="preserve"> — the banner shows the version. The interactive API docs live at </w:t>
+      </w:r>
+      <w:r>
+        <w:rPr>
+          <w:rFonts w:ascii="Consolas" w:hAnsi="Consolas"/>
+          <w:color w:val="0A5560"/>
+          <w:sz w:val="20"/>
+          <w:szCs w:val="20"/>
+        </w:rPr>
+        <w:t xml:space="preserve">http://127.0.0.1:5001/docs</w:t>
+      </w:r>
+      <w:r>
+        <w:t xml:space="preserve">.</w:t>
+      </w:r>
+    </w:p>
+    <w:p>
+      <w:pPr>
+        <w:pStyle w:val="Heading2"/>
+      </w:pPr>
+      <w:r>
+        <w:t xml:space="preserve">Updating an existing checkout (Windows 11)</w:t>
+      </w:r>
+    </w:p>
+    <w:p>
+      <w:pPr>
+        <w:pBdr>
+          <w:left w:val="single" w:sz="12" w:space="8" w:color="1C7293"/>
+        </w:pBdr>
+        <w:shd w:val="clear" w:color="auto" w:fill="F4F7F9"/>
+        <w:spacing w:before="0" w:after="0"/>
+        <w:ind w:left="240"/>
+      </w:pPr>
+      <w:r>
+        <w:rPr>
+          <w:rFonts w:ascii="Consolas" w:hAnsi="Consolas"/>
+          <w:sz w:val="19"/>
+          <w:szCs w:val="19"/>
+          <w:color w:val="0A3D52"/>
+        </w:rPr>
+        <w:t xml:space="preserve">cd PDC-Policy-Generator</w:t>
+      </w:r>
+    </w:p>
+    <w:p>
+      <w:pPr>
+        <w:pBdr>
+          <w:left w:val="single" w:sz="12" w:space="8" w:color="1C7293"/>
+        </w:pBdr>
+        <w:shd w:val="clear" w:color="auto" w:fill="F4F7F9"/>
+        <w:spacing w:before="0" w:after="0"/>
+        <w:ind w:left="240"/>
+      </w:pPr>
+      <w:r>
+        <w:rPr>
+          <w:rFonts w:ascii="Consolas" w:hAnsi="Consolas"/>
+          <w:sz w:val="19"/>
+          <w:szCs w:val="19"/>
+          <w:color w:val="0A3D52"/>
+        </w:rPr>
+        <w:t xml:space="preserve">git pull                                 # same repo everywhere — root is conventional</w:t>
+      </w:r>
+    </w:p>
+    <w:p>
+      <w:pPr>
+        <w:pBdr>
+          <w:left w:val="single" w:sz="12" w:space="8" w:color="1C7293"/>
+        </w:pBdr>
+        <w:shd w:val="clear" w:color="auto" w:fill="F4F7F9"/>
+        <w:spacing w:before="0" w:after="0"/>
+        <w:ind w:left="240"/>
+      </w:pPr>
+      <w:r>
+        <w:rPr>
+          <w:rFonts w:ascii="Consolas" w:hAnsi="Consolas"/>
+          <w:sz w:val="19"/>
+          <w:szCs w:val="19"/>
+          <w:color w:val="0A3D52"/>
+        </w:rPr>
+        <w:t xml:space="preserve">cd frontend; npm install; npm run build  # ONLY needed when frontend/ changed</w:t>
+      </w:r>
+    </w:p>
+    <w:p>
+      <w:pPr>
+        <w:pBdr>
+          <w:left w:val="single" w:sz="12" w:space="8" w:color="1C7293"/>
+        </w:pBdr>
+        <w:shd w:val="clear" w:color="auto" w:fill="F4F7F9"/>
+        <w:spacing w:before="0" w:after="0"/>
+        <w:ind w:left="240"/>
+      </w:pPr>
+      <w:r>
+        <w:rPr>
+          <w:rFonts w:ascii="Consolas" w:hAnsi="Consolas"/>
+          <w:sz w:val="19"/>
+          <w:szCs w:val="19"/>
+          <w:color w:val="0A3D52"/>
+        </w:rPr>
+        <w:t xml:space="preserve">cd ..\policy_generator; .\run.ps1        # python deps reinstall automatically when</w:t>
+      </w:r>
+    </w:p>
+    <w:p>
+      <w:pPr>
+        <w:pBdr>
+          <w:left w:val="single" w:sz="12" w:space="8" w:color="1C7293"/>
+        </w:pBdr>
+        <w:shd w:val="clear" w:color="auto" w:fill="F4F7F9"/>
+        <w:spacing w:before="0" w:after="120"/>
+        <w:ind w:left="240"/>
+      </w:pPr>
+      <w:r>
+        <w:rPr>
+          <w:rFonts w:ascii="Consolas" w:hAnsi="Consolas"/>
+          <w:sz w:val="19"/>
+          <w:szCs w:val="19"/>
+          <w:color w:val="0A3D52"/>
+        </w:rPr>
+        <w:t xml:space="preserve">                                         # requirements.txt changed (launcher hashes it)</w:t>
+      </w:r>
+    </w:p>
+    <w:p>
+      <w:pPr>
+        <w:spacing w:after="120"/>
+      </w:pPr>
+      <w:r>
+        <w:t xml:space="preserve">If you skip the UI rebuild after a pull that touched </w:t>
+      </w:r>
+      <w:r>
+        <w:rPr>
+          <w:rFonts w:ascii="Consolas" w:hAnsi="Consolas"/>
+          <w:color w:val="0A5560"/>
+          <w:sz w:val="20"/>
+          <w:szCs w:val="20"/>
+        </w:rPr>
+        <w:t xml:space="preserve">frontend/</w:t>
+      </w:r>
+      <w:r>
+        <w:t xml:space="preserve">, the app still runs but serves the previous UI bundle — the launcher can't detect that.</w:t>
       </w:r>
     </w:p>
     <w:p>
@@ -2776,7 +3370,7 @@
           <w:left w:val="single" w:sz="12" w:space="8" w:color="1C7293"/>
         </w:pBdr>
         <w:shd w:val="clear" w:color="auto" w:fill="F4F7F9"/>
-        <w:spacing w:before="0" w:after="120"/>
+        <w:spacing w:before="0" w:after="0"/>
         <w:ind w:left="240"/>
       </w:pPr>
       <w:r>
@@ -2786,60 +3380,26 @@
           <w:szCs w:val="19"/>
           <w:color w:val="0A3D52"/>
         </w:rPr>
-        <w:t xml:space="preserve">python -m policy_generator.selftest</w:t>
-      </w:r>
-    </w:p>
-    <w:p>
-      <w:pPr>
-        <w:spacing w:after="120"/>
-      </w:pPr>
-      <w:r>
-        <w:rPr>
-          <w:b/>
-          <w:bCs/>
-        </w:rPr>
-        <w:t xml:space="preserve">Success looks like this:</w:t>
-      </w:r>
-      <w:r>
-        <w:t xml:space="preserve"> </w:t>
-      </w:r>
-      <w:r>
-        <w:rPr>
-          <w:rFonts w:ascii="Consolas" w:hAnsi="Consolas"/>
-          <w:color w:val="0A5560"/>
-          <w:sz w:val="20"/>
-          <w:szCs w:val="20"/>
-        </w:rPr>
-        <w:t xml:space="preserve">20 passed, 0 failed</w:t>
-      </w:r>
-      <w:r>
-        <w:t xml:space="preserve"> — the selftest builds a fixture Registry in memory and exercises the whole author pipeline offline.</w:t>
-      </w:r>
-    </w:p>
-    <w:p>
-      <w:pPr>
-        <w:spacing w:after="120"/>
-      </w:pPr>
-      <w:r>
-        <w:t xml:space="preserve">Then load a real Registry in the UI (drag-drop, or paste its path) and check the contract summary: concepts, seeds, resolved term ids, governed tags. The expandable </w:t>
-      </w:r>
-      <w:r>
-        <w:rPr>
-          <w:b/>
-          <w:bCs/>
-        </w:rPr>
-        <w:t xml:space="preserve">"What the summary numbers mean"</w:t>
-      </w:r>
-      <w:r>
-        <w:t xml:space="preserve"> panel on the page explains each number and what to do when it looks wrong.</w:t>
-      </w:r>
-    </w:p>
-    <w:p>
-      <w:pPr>
-        <w:pStyle w:val="Heading1"/>
-      </w:pPr>
-      <w:r>
-        <w:t xml:space="preserve">Part E — Keeping the app up to date</w:t>
+        <w:t xml:space="preserve"># from the repo root (the folder that CONTAINS policy_generator/):</w:t>
+      </w:r>
+    </w:p>
+    <w:p>
+      <w:pPr>
+        <w:pBdr>
+          <w:left w:val="single" w:sz="12" w:space="8" w:color="1C7293"/>
+        </w:pBdr>
+        <w:shd w:val="clear" w:color="auto" w:fill="F4F7F9"/>
+        <w:spacing w:before="0" w:after="0"/>
+        <w:ind w:left="240"/>
+      </w:pPr>
+      <w:r>
+        <w:rPr>
+          <w:rFonts w:ascii="Consolas" w:hAnsi="Consolas"/>
+          <w:sz w:val="19"/>
+          <w:szCs w:val="19"/>
+          <w:color w:val="0A3D52"/>
+        </w:rPr>
+        <w:t xml:space="preserve">pip install -e ".[dev]"</w:t>
       </w:r>
     </w:p>
     <w:p>
@@ -2858,7 +3418,7 @@
           <w:szCs w:val="19"/>
           <w:color w:val="0A3D52"/>
         </w:rPr>
-        <w:t xml:space="preserve">git pull</w:t>
+        <w:t xml:space="preserve">pytest</w:t>
       </w:r>
     </w:p>
     <w:p>
@@ -2866,7 +3426,14 @@
         <w:spacing w:after="120"/>
       </w:pPr>
       <w:r>
-        <w:t xml:space="preserve">Restart the launcher afterwards — it detects a changed </w:t>
+        <w:rPr>
+          <w:b/>
+          <w:bCs/>
+        </w:rPr>
+        <w:t xml:space="preserve">Success looks like this:</w:t>
+      </w:r>
+      <w:r>
+        <w:t xml:space="preserve"> </w:t>
       </w:r>
       <w:r>
         <w:rPr>
@@ -2875,10 +3442,63 @@
           <w:sz w:val="20"/>
           <w:szCs w:val="20"/>
         </w:rPr>
-        <w:t xml:space="preserve">requirements.txt</w:t>
-      </w:r>
-      <w:r>
-        <w:t xml:space="preserve"> and re-installs only then. Your </w:t>
+        <w:t xml:space="preserve">20 passed</w:t>
+      </w:r>
+      <w:r>
+        <w:t xml:space="preserve"> — the suite builds a fixture Registry in memory and exercises the whole author pipeline plus the API (reconcile and retire run against a mocked PDC — fully offline). It also fails if any version marker (VERSION / VERSION.md / README / CHANGELOG) drifts out of agreement.</w:t>
+      </w:r>
+    </w:p>
+    <w:p>
+      <w:pPr>
+        <w:spacing w:after="120"/>
+      </w:pPr>
+      <w:r>
+        <w:t xml:space="preserve">Then load a real Registry in the UI (drag-drop, or paste its path) and check the contract summary: concepts, seeds, resolved term ids, governed tags. The expandable </w:t>
+      </w:r>
+      <w:r>
+        <w:rPr>
+          <w:b/>
+          <w:bCs/>
+        </w:rPr>
+        <w:t xml:space="preserve">"What the summary numbers mean"</w:t>
+      </w:r>
+      <w:r>
+        <w:t xml:space="preserve"> panel on the page explains each number and what to do when it looks wrong.</w:t>
+      </w:r>
+    </w:p>
+    <w:p>
+      <w:pPr>
+        <w:pStyle w:val="Heading1"/>
+      </w:pPr>
+      <w:r>
+        <w:t xml:space="preserve">Part E — Keeping the app up to date</w:t>
+      </w:r>
+    </w:p>
+    <w:p>
+      <w:pPr>
+        <w:pBdr>
+          <w:left w:val="single" w:sz="12" w:space="8" w:color="1C7293"/>
+        </w:pBdr>
+        <w:shd w:val="clear" w:color="auto" w:fill="F4F7F9"/>
+        <w:spacing w:before="0" w:after="120"/>
+        <w:ind w:left="240"/>
+      </w:pPr>
+      <w:r>
+        <w:rPr>
+          <w:rFonts w:ascii="Consolas" w:hAnsi="Consolas"/>
+          <w:sz w:val="19"/>
+          <w:szCs w:val="19"/>
+          <w:color w:val="0A3D52"/>
+        </w:rPr>
+        <w:t xml:space="preserve">git pull</w:t>
+      </w:r>
+    </w:p>
+    <w:p>
+      <w:pPr>
+        <w:spacing w:after="120"/>
+      </w:pPr>
+      <w:r>
+        <w:t xml:space="preserve">Restart the launcher afterwards — it detects a changed </w:t>
       </w:r>
       <w:r>
         <w:rPr>
@@ -2887,10 +3507,10 @@
           <w:sz w:val="20"/>
           <w:szCs w:val="20"/>
         </w:rPr>
-        <w:t xml:space="preserve">.venv</w:t>
-      </w:r>
-      <w:r>
-        <w:t xml:space="preserve"> and any authored </w:t>
+        <w:t xml:space="preserve">requirements.txt</w:t>
+      </w:r>
+      <w:r>
+        <w:t xml:space="preserve"> and re-installs only then. Your </w:t>
       </w:r>
       <w:r>
         <w:rPr>
@@ -2899,26 +3519,10 @@
           <w:sz w:val="20"/>
           <w:szCs w:val="20"/>
         </w:rPr>
-        <w:t xml:space="preserve">out/</w:t>
-      </w:r>
-      <w:r>
-        <w:t xml:space="preserve"> directories are git-ignored and survive updates.</w:t>
-      </w:r>
-    </w:p>
-    <w:p>
-      <w:pPr>
-        <w:pStyle w:val="Heading1"/>
-      </w:pPr>
-      <w:r>
-        <w:t xml:space="preserve">Part F — The PDC side (when you're ready to import)</w:t>
-      </w:r>
-    </w:p>
-    <w:p>
-      <w:pPr>
-        <w:spacing w:after="120"/>
-      </w:pPr>
-      <w:r>
-        <w:t xml:space="preserve">The authored zip is shaped for PDC's UI import — the full walkthrough with checkpoints is the CSCU workshop (PDC-Scenarios' </w:t>
+        <w:t xml:space="preserve">.venv</w:t>
+      </w:r>
+      <w:r>
+        <w:t xml:space="preserve"> and any authored </w:t>
       </w:r>
       <w:r>
         <w:rPr>
@@ -2927,6 +3531,34 @@
           <w:sz w:val="20"/>
           <w:szCs w:val="20"/>
         </w:rPr>
+        <w:t xml:space="preserve">out/</w:t>
+      </w:r>
+      <w:r>
+        <w:t xml:space="preserve"> directories are git-ignored and survive updates.</w:t>
+      </w:r>
+    </w:p>
+    <w:p>
+      <w:pPr>
+        <w:pStyle w:val="Heading1"/>
+      </w:pPr>
+      <w:r>
+        <w:t xml:space="preserve">Part F — The PDC side (when you're ready to import)</w:t>
+      </w:r>
+    </w:p>
+    <w:p>
+      <w:pPr>
+        <w:spacing w:after="120"/>
+      </w:pPr>
+      <w:r>
+        <w:t xml:space="preserve">The authored zip is shaped for PDC's UI import — the full walkthrough with checkpoints is the CSCU workshop (PDC-Scenarios' </w:t>
+      </w:r>
+      <w:r>
+        <w:rPr>
+          <w:rFonts w:ascii="Consolas" w:hAnsi="Consolas"/>
+          <w:color w:val="0A5560"/>
+          <w:sz w:val="20"/>
+          <w:szCs w:val="20"/>
+        </w:rPr>
         <w:t xml:space="preserve">courseware/CSCU/Policy/Workshop-Policy-Generator-CSCU.md</w:t>
       </w:r>
       <w:r>
@@ -2938,7 +3570,7 @@
         <w:pStyle w:val="ListParagraph"/>
         <w:numPr>
           <w:ilvl w:val="0"/>
-          <w:numId w:val="100"/>
+          <w:numId w:val="104"/>
         </w:numPr>
         <w:spacing w:after="80" w:line="264" w:lineRule="auto"/>
       </w:pPr>
@@ -2970,7 +3602,7 @@
         <w:pStyle w:val="ListParagraph"/>
         <w:numPr>
           <w:ilvl w:val="0"/>
-          <w:numId w:val="100"/>
+          <w:numId w:val="104"/>
         </w:numPr>
         <w:spacing w:after="80" w:line="264" w:lineRule="auto"/>
       </w:pPr>
@@ -3012,7 +3644,7 @@
         <w:pStyle w:val="ListParagraph"/>
         <w:numPr>
           <w:ilvl w:val="0"/>
-          <w:numId w:val="100"/>
+          <w:numId w:val="104"/>
         </w:numPr>
         <w:spacing w:after="80" w:line="264" w:lineRule="auto"/>
       </w:pPr>
@@ -3045,7 +3677,7 @@
         <w:pStyle w:val="ListParagraph"/>
         <w:numPr>
           <w:ilvl w:val="0"/>
-          <w:numId w:val="100"/>
+          <w:numId w:val="104"/>
         </w:numPr>
         <w:spacing w:after="80" w:line="264" w:lineRule="auto"/>
       </w:pPr>
@@ -5213,6 +5845,30 @@
     <w:abstractNumId w:val="3"/>
   </w:num>
   <w:num w:numId="100">
+    <w:abstractNumId w:val="23"/>
+    <w:lvlOverride w:ilvl="0">
+      <w:startOverride w:val="1"/>
+    </w:lvlOverride>
+  </w:num>
+  <w:num w:numId="101">
+    <w:abstractNumId w:val="23"/>
+    <w:lvlOverride w:ilvl="0">
+      <w:startOverride w:val="1"/>
+    </w:lvlOverride>
+  </w:num>
+  <w:num w:numId="102">
+    <w:abstractNumId w:val="23"/>
+    <w:lvlOverride w:ilvl="0">
+      <w:startOverride w:val="1"/>
+    </w:lvlOverride>
+  </w:num>
+  <w:num w:numId="103">
+    <w:abstractNumId w:val="23"/>
+    <w:lvlOverride w:ilvl="0">
+      <w:startOverride w:val="1"/>
+    </w:lvlOverride>
+  </w:num>
+  <w:num w:numId="104">
     <w:abstractNumId w:val="23"/>
     <w:lvlOverride w:ilvl="0">
       <w:startOverride w:val="1"/>

</xml_diff>